<commit_message>
Actualizacion de FD03-FD04 #7
</commit_message>
<xml_diff>
--- a/FD03-EPIS-Informe Especificación Requerimientos.docx
+++ b/FD03-EPIS-Informe Especificación Requerimientos.docx
@@ -28,12 +28,12 @@
           <wp:inline distB="0" distT="0" distL="0" distR="0">
             <wp:extent cx="999140" cy="1343105"/>
             <wp:effectExtent b="0" l="0" r="0" t="0"/>
-            <wp:docPr descr="C:\Users\EPIS\Documents\upt.png" id="14" name="image16.png"/>
+            <wp:docPr descr="C:\Users\EPIS\Documents\upt.png" id="14" name="image1.png"/>
             <a:graphic>
               <a:graphicData uri="http://schemas.openxmlformats.org/drawingml/2006/picture">
                 <pic:pic>
                   <pic:nvPicPr>
-                    <pic:cNvPr descr="C:\Users\EPIS\Documents\upt.png" id="0" name="image16.png"/>
+                    <pic:cNvPr descr="C:\Users\EPIS\Documents\upt.png" id="0" name="image1.png"/>
                     <pic:cNvPicPr preferRelativeResize="0"/>
                   </pic:nvPicPr>
                   <pic:blipFill>
@@ -2109,7 +2109,7 @@
     </w:p>
     <w:sdt>
       <w:sdtPr>
-        <w:id w:val="1941531095"/>
+        <w:id w:val="-1564910427"/>
         <w:docPartObj>
           <w:docPartGallery w:val="Table of Contents"/>
           <w:docPartUnique w:val="1"/>
@@ -4883,12 +4883,12 @@
           <wp:inline distB="114300" distT="114300" distL="114300" distR="114300">
             <wp:extent cx="4592775" cy="5629592"/>
             <wp:effectExtent b="25400" l="25400" r="25400" t="25400"/>
-            <wp:docPr id="7" name="image8.png"/>
+            <wp:docPr id="7" name="image14.png"/>
             <a:graphic>
               <a:graphicData uri="http://schemas.openxmlformats.org/drawingml/2006/picture">
                 <pic:pic>
                   <pic:nvPicPr>
-                    <pic:cNvPr id="0" name="image8.png"/>
+                    <pic:cNvPr id="0" name="image14.png"/>
                     <pic:cNvPicPr preferRelativeResize="0"/>
                   </pic:nvPicPr>
                   <pic:blipFill>
@@ -5027,7 +5027,7 @@
     <w:sdt>
       <w:sdtPr>
         <w:lock w:val="contentLocked"/>
-        <w:id w:val="-588048195"/>
+        <w:id w:val="-151484784"/>
         <w:tag w:val="goog_rdk_0"/>
       </w:sdtPr>
       <w:sdtContent>
@@ -6741,37 +6741,126 @@
           </w:p>
         </w:tc>
       </w:tr>
+      <w:tr>
+        <w:trPr>
+          <w:cantSplit w:val="0"/>
+          <w:trHeight w:val="825" w:hRule="atLeast"/>
+          <w:tblHeader w:val="0"/>
+        </w:trPr>
+        <w:tc>
+          <w:tcPr>
+            <w:tcBorders>
+              <w:top w:color="000000" w:space="0" w:sz="0" w:val="nil"/>
+              <w:left w:color="000000" w:space="0" w:sz="6" w:val="single"/>
+              <w:bottom w:color="000000" w:space="0" w:sz="6" w:val="single"/>
+              <w:right w:color="000000" w:space="0" w:sz="6" w:val="single"/>
+            </w:tcBorders>
+            <w:tcMar>
+              <w:top w:w="0.0" w:type="dxa"/>
+              <w:left w:w="100.0" w:type="dxa"/>
+              <w:bottom w:w="0.0" w:type="dxa"/>
+              <w:right w:w="100.0" w:type="dxa"/>
+            </w:tcMar>
+            <w:vAlign w:val="top"/>
+          </w:tcPr>
+          <w:p>
+            <w:pPr>
+              <w:spacing w:after="0" w:line="360" w:lineRule="auto"/>
+              <w:rPr>
+                <w:rFonts w:ascii="Times New Roman" w:cs="Times New Roman" w:eastAsia="Times New Roman" w:hAnsi="Times New Roman"/>
+                <w:b w:val="1"/>
+                <w:bCs w:val="1"/>
+                <w:sz w:val="24"/>
+                <w:szCs w:val="24"/>
+              </w:rPr>
+            </w:pPr>
+            <w:r>
+              <w:rPr>
+                <w:rFonts w:ascii="Times New Roman" w:cs="Times New Roman" w:eastAsia="Times New Roman" w:hAnsi="Times New Roman"/>
+                <w:b w:val="1"/>
+                <w:bCs w:val="1"/>
+                <w:sz w:val="24"/>
+                <w:szCs w:val="24"/>
+                <w:rtl w:val="0"/>
+              </w:rPr>
+              <w:t xml:space="preserve">RF-07</w:t>
+            </w:r>
+          </w:p>
+        </w:tc>
+        <w:tc>
+          <w:tcPr>
+            <w:tcBorders>
+              <w:top w:color="000000" w:space="0" w:sz="0" w:val="nil"/>
+              <w:left w:color="000000" w:space="0" w:sz="0" w:val="nil"/>
+              <w:bottom w:color="000000" w:space="0" w:sz="6" w:val="single"/>
+              <w:right w:color="000000" w:space="0" w:sz="6" w:val="single"/>
+            </w:tcBorders>
+            <w:tcMar>
+              <w:top w:w="0.0" w:type="dxa"/>
+              <w:left w:w="100.0" w:type="dxa"/>
+              <w:bottom w:w="0.0" w:type="dxa"/>
+              <w:right w:w="100.0" w:type="dxa"/>
+            </w:tcMar>
+            <w:vAlign w:val="top"/>
+          </w:tcPr>
+          <w:p>
+            <w:pPr>
+              <w:spacing w:after="0" w:line="360" w:lineRule="auto"/>
+              <w:rPr>
+                <w:rFonts w:ascii="Times New Roman" w:cs="Times New Roman" w:eastAsia="Times New Roman" w:hAnsi="Times New Roman"/>
+                <w:sz w:val="24"/>
+                <w:szCs w:val="24"/>
+              </w:rPr>
+            </w:pPr>
+            <w:r>
+              <w:rPr>
+                <w:rFonts w:ascii="Times New Roman" w:cs="Times New Roman" w:eastAsia="Times New Roman" w:hAnsi="Times New Roman"/>
+                <w:sz w:val="24"/>
+                <w:szCs w:val="24"/>
+                <w:rtl w:val="0"/>
+              </w:rPr>
+              <w:t xml:space="preserve">Gestión de inventario</w:t>
+            </w:r>
+          </w:p>
+        </w:tc>
+        <w:tc>
+          <w:tcPr>
+            <w:tcBorders>
+              <w:top w:color="000000" w:space="0" w:sz="0" w:val="nil"/>
+              <w:left w:color="000000" w:space="0" w:sz="0" w:val="nil"/>
+              <w:bottom w:color="000000" w:space="0" w:sz="6" w:val="single"/>
+              <w:right w:color="000000" w:space="0" w:sz="6" w:val="single"/>
+            </w:tcBorders>
+            <w:tcMar>
+              <w:top w:w="0.0" w:type="dxa"/>
+              <w:left w:w="100.0" w:type="dxa"/>
+              <w:bottom w:w="0.0" w:type="dxa"/>
+              <w:right w:w="100.0" w:type="dxa"/>
+            </w:tcMar>
+            <w:vAlign w:val="top"/>
+          </w:tcPr>
+          <w:p>
+            <w:pPr>
+              <w:spacing w:after="0" w:line="360" w:lineRule="auto"/>
+              <w:rPr>
+                <w:rFonts w:ascii="Times New Roman" w:cs="Times New Roman" w:eastAsia="Times New Roman" w:hAnsi="Times New Roman"/>
+                <w:sz w:val="24"/>
+                <w:szCs w:val="24"/>
+              </w:rPr>
+            </w:pPr>
+            <w:r>
+              <w:rPr>
+                <w:rFonts w:ascii="Times New Roman" w:cs="Times New Roman" w:eastAsia="Times New Roman" w:hAnsi="Times New Roman"/>
+                <w:sz w:val="24"/>
+                <w:szCs w:val="24"/>
+                <w:rtl w:val="0"/>
+              </w:rPr>
+              <w:t xml:space="preserve">El sistema debe permitir la administración integral (crear, leer, actualizar y eliminar) de los registros bibliográficos del inventario físico local almacenados en la base de datos institucional.</w:t>
+            </w:r>
+          </w:p>
+        </w:tc>
+      </w:tr>
     </w:tbl>
-    <w:p>
-      <w:pPr>
-        <w:spacing w:line="360" w:lineRule="auto"/>
-        <w:rPr>
-          <w:rFonts w:ascii="Times New Roman" w:cs="Times New Roman" w:eastAsia="Times New Roman" w:hAnsi="Times New Roman"/>
-          <w:sz w:val="24"/>
-          <w:szCs w:val="24"/>
-        </w:rPr>
-      </w:pPr>
-      <w:r>
-        <w:rPr>
-          <w:rtl w:val="0"/>
-        </w:rPr>
-      </w:r>
-    </w:p>
-    <w:p>
-      <w:pPr>
-        <w:spacing w:line="360" w:lineRule="auto"/>
-        <w:rPr>
-          <w:rFonts w:ascii="Times New Roman" w:cs="Times New Roman" w:eastAsia="Times New Roman" w:hAnsi="Times New Roman"/>
-          <w:sz w:val="24"/>
-          <w:szCs w:val="24"/>
-        </w:rPr>
-      </w:pPr>
-      <w:r>
-        <w:rPr>
-          <w:rtl w:val="0"/>
-        </w:rPr>
-      </w:r>
-    </w:p>
     <w:p>
       <w:pPr>
         <w:spacing w:line="360" w:lineRule="auto"/>
@@ -8040,12 +8129,12 @@
           <wp:inline distB="114300" distT="114300" distL="114300" distR="114300">
             <wp:extent cx="3752850" cy="5133975"/>
             <wp:effectExtent b="0" l="0" r="0" t="0"/>
-            <wp:docPr id="10" name="image13.png"/>
+            <wp:docPr id="10" name="image2.png"/>
             <a:graphic>
               <a:graphicData uri="http://schemas.openxmlformats.org/drawingml/2006/picture">
                 <pic:pic>
                   <pic:nvPicPr>
-                    <pic:cNvPr id="0" name="image13.png"/>
+                    <pic:cNvPr id="0" name="image2.png"/>
                     <pic:cNvPicPr preferRelativeResize="0"/>
                   </pic:nvPicPr>
                   <pic:blipFill>
@@ -8240,7 +8329,7 @@
     <w:sdt>
       <w:sdtPr>
         <w:lock w:val="contentLocked"/>
-        <w:id w:val="-1603851265"/>
+        <w:id w:val="1402165593"/>
         <w:tag w:val="goog_rdk_1"/>
       </w:sdtPr>
       <w:sdtContent>
@@ -9315,7 +9404,7 @@
     <w:sdt>
       <w:sdtPr>
         <w:lock w:val="contentLocked"/>
-        <w:id w:val="-1002515070"/>
+        <w:id w:val="1279317165"/>
         <w:tag w:val="goog_rdk_2"/>
       </w:sdtPr>
       <w:sdtContent>
@@ -10244,7 +10333,7 @@
     <w:sdt>
       <w:sdtPr>
         <w:lock w:val="contentLocked"/>
-        <w:id w:val="-654430609"/>
+        <w:id w:val="1142151055"/>
         <w:tag w:val="goog_rdk_3"/>
       </w:sdtPr>
       <w:sdtContent>
@@ -11096,7 +11185,7 @@
     <w:sdt>
       <w:sdtPr>
         <w:lock w:val="contentLocked"/>
-        <w:id w:val="142328066"/>
+        <w:id w:val="1115411378"/>
         <w:tag w:val="goog_rdk_4"/>
       </w:sdtPr>
       <w:sdtContent>
@@ -12027,7 +12116,7 @@
     <w:sdt>
       <w:sdtPr>
         <w:lock w:val="contentLocked"/>
-        <w:id w:val="2062233181"/>
+        <w:id w:val="2079326821"/>
         <w:tag w:val="goog_rdk_5"/>
       </w:sdtPr>
       <w:sdtContent>
@@ -12864,7 +12953,7 @@
     <w:sdt>
       <w:sdtPr>
         <w:lock w:val="contentLocked"/>
-        <w:id w:val="898018562"/>
+        <w:id w:val="-1845562625"/>
         <w:tag w:val="goog_rdk_6"/>
       </w:sdtPr>
       <w:sdtContent>
@@ -14797,12 +14886,12 @@
           <wp:inline distB="114300" distT="114300" distL="114300" distR="114300">
             <wp:extent cx="4762500" cy="5724525"/>
             <wp:effectExtent b="25400" l="25400" r="25400" t="25400"/>
-            <wp:docPr id="4" name="image9.png"/>
+            <wp:docPr id="4" name="image8.png"/>
             <a:graphic>
               <a:graphicData uri="http://schemas.openxmlformats.org/drawingml/2006/picture">
                 <pic:pic>
                   <pic:nvPicPr>
-                    <pic:cNvPr id="0" name="image9.png"/>
+                    <pic:cNvPr id="0" name="image8.png"/>
                     <pic:cNvPicPr preferRelativeResize="0"/>
                   </pic:nvPicPr>
                   <pic:blipFill>
@@ -15036,12 +15125,12 @@
           <wp:inline distB="114300" distT="114300" distL="114300" distR="114300">
             <wp:extent cx="5399730" cy="4953000"/>
             <wp:effectExtent b="25400" l="25400" r="25400" t="25400"/>
-            <wp:docPr id="9" name="image6.png"/>
+            <wp:docPr id="9" name="image15.png"/>
             <a:graphic>
               <a:graphicData uri="http://schemas.openxmlformats.org/drawingml/2006/picture">
                 <pic:pic>
                   <pic:nvPicPr>
-                    <pic:cNvPr id="0" name="image6.png"/>
+                    <pic:cNvPr id="0" name="image15.png"/>
                     <pic:cNvPicPr preferRelativeResize="0"/>
                   </pic:nvPicPr>
                   <pic:blipFill>
@@ -15224,12 +15313,12 @@
           <wp:inline distB="114300" distT="114300" distL="114300" distR="114300">
             <wp:extent cx="5399730" cy="4254500"/>
             <wp:effectExtent b="25400" l="25400" r="25400" t="25400"/>
-            <wp:docPr id="3" name="image5.png"/>
+            <wp:docPr id="3" name="image13.png"/>
             <a:graphic>
               <a:graphicData uri="http://schemas.openxmlformats.org/drawingml/2006/picture">
                 <pic:pic>
                   <pic:nvPicPr>
-                    <pic:cNvPr id="0" name="image5.png"/>
+                    <pic:cNvPr id="0" name="image13.png"/>
                     <pic:cNvPicPr preferRelativeResize="0"/>
                   </pic:nvPicPr>
                   <pic:blipFill>
@@ -15514,12 +15603,12 @@
           <wp:inline distB="114300" distT="114300" distL="114300" distR="114300">
             <wp:extent cx="5399730" cy="6235700"/>
             <wp:effectExtent b="25400" l="25400" r="25400" t="25400"/>
-            <wp:docPr id="5" name="image1.png"/>
+            <wp:docPr id="5" name="image11.png"/>
             <a:graphic>
               <a:graphicData uri="http://schemas.openxmlformats.org/drawingml/2006/picture">
                 <pic:pic>
                   <pic:nvPicPr>
-                    <pic:cNvPr id="0" name="image1.png"/>
+                    <pic:cNvPr id="0" name="image11.png"/>
                     <pic:cNvPicPr preferRelativeResize="0"/>
                   </pic:nvPicPr>
                   <pic:blipFill>
@@ -15685,12 +15774,12 @@
           <wp:inline distB="114300" distT="114300" distL="114300" distR="114300">
             <wp:extent cx="5399730" cy="4127500"/>
             <wp:effectExtent b="25400" l="25400" r="25400" t="25400"/>
-            <wp:docPr id="2" name="image15.png"/>
+            <wp:docPr id="2" name="image5.png"/>
             <a:graphic>
               <a:graphicData uri="http://schemas.openxmlformats.org/drawingml/2006/picture">
                 <pic:pic>
                   <pic:nvPicPr>
-                    <pic:cNvPr id="0" name="image15.png"/>
+                    <pic:cNvPr id="0" name="image5.png"/>
                     <pic:cNvPicPr preferRelativeResize="0"/>
                   </pic:nvPicPr>
                   <pic:blipFill>
@@ -15958,12 +16047,12 @@
           <wp:inline distB="114300" distT="114300" distL="114300" distR="114300">
             <wp:extent cx="5399730" cy="3581400"/>
             <wp:effectExtent b="25400" l="25400" r="25400" t="25400"/>
-            <wp:docPr id="12" name="image7.png"/>
+            <wp:docPr id="12" name="image4.png"/>
             <a:graphic>
               <a:graphicData uri="http://schemas.openxmlformats.org/drawingml/2006/picture">
                 <pic:pic>
                   <pic:nvPicPr>
-                    <pic:cNvPr id="0" name="image7.png"/>
+                    <pic:cNvPr id="0" name="image4.png"/>
                     <pic:cNvPicPr preferRelativeResize="0"/>
                   </pic:nvPicPr>
                   <pic:blipFill>
@@ -16235,12 +16324,12 @@
           <wp:inline distB="114300" distT="114300" distL="114300" distR="114300">
             <wp:extent cx="5399730" cy="3314700"/>
             <wp:effectExtent b="25400" l="25400" r="25400" t="25400"/>
-            <wp:docPr id="15" name="image11.png"/>
+            <wp:docPr id="15" name="image9.png"/>
             <a:graphic>
               <a:graphicData uri="http://schemas.openxmlformats.org/drawingml/2006/picture">
                 <pic:pic>
                   <pic:nvPicPr>
-                    <pic:cNvPr id="0" name="image11.png"/>
+                    <pic:cNvPr id="0" name="image9.png"/>
                     <pic:cNvPicPr preferRelativeResize="0"/>
                   </pic:nvPicPr>
                   <pic:blipFill>
@@ -16321,12 +16410,12 @@
           <wp:inline distB="114300" distT="114300" distL="114300" distR="114300">
             <wp:extent cx="5399730" cy="3086100"/>
             <wp:effectExtent b="25400" l="25400" r="25400" t="25400"/>
-            <wp:docPr id="16" name="image17.png"/>
+            <wp:docPr id="16" name="image3.png"/>
             <a:graphic>
               <a:graphicData uri="http://schemas.openxmlformats.org/drawingml/2006/picture">
                 <pic:pic>
                   <pic:nvPicPr>
-                    <pic:cNvPr id="0" name="image17.png"/>
+                    <pic:cNvPr id="0" name="image3.png"/>
                     <pic:cNvPicPr preferRelativeResize="0"/>
                   </pic:nvPicPr>
                   <pic:blipFill>
@@ -16441,12 +16530,12 @@
           <wp:inline distB="114300" distT="114300" distL="114300" distR="114300">
             <wp:extent cx="5399730" cy="3200400"/>
             <wp:effectExtent b="25400" l="25400" r="25400" t="25400"/>
-            <wp:docPr id="8" name="image2.png"/>
+            <wp:docPr id="8" name="image12.png"/>
             <a:graphic>
               <a:graphicData uri="http://schemas.openxmlformats.org/drawingml/2006/picture">
                 <pic:pic>
                   <pic:nvPicPr>
-                    <pic:cNvPr id="0" name="image2.png"/>
+                    <pic:cNvPr id="0" name="image12.png"/>
                     <pic:cNvPicPr preferRelativeResize="0"/>
                   </pic:nvPicPr>
                   <pic:blipFill>
@@ -16527,12 +16616,12 @@
           <wp:inline distB="114300" distT="114300" distL="114300" distR="114300">
             <wp:extent cx="5399730" cy="3683000"/>
             <wp:effectExtent b="25400" l="25400" r="25400" t="25400"/>
-            <wp:docPr id="17" name="image3.png"/>
+            <wp:docPr id="17" name="image16.png"/>
             <a:graphic>
               <a:graphicData uri="http://schemas.openxmlformats.org/drawingml/2006/picture">
                 <pic:pic>
                   <pic:nvPicPr>
-                    <pic:cNvPr id="0" name="image3.png"/>
+                    <pic:cNvPr id="0" name="image16.png"/>
                     <pic:cNvPicPr preferRelativeResize="0"/>
                   </pic:nvPicPr>
                   <pic:blipFill>
@@ -16681,12 +16770,12 @@
           <wp:inline distB="114300" distT="114300" distL="114300" distR="114300">
             <wp:extent cx="5399730" cy="2743200"/>
             <wp:effectExtent b="25400" l="25400" r="25400" t="25400"/>
-            <wp:docPr id="11" name="image14.png"/>
+            <wp:docPr id="11" name="image7.png"/>
             <a:graphic>
               <a:graphicData uri="http://schemas.openxmlformats.org/drawingml/2006/picture">
                 <pic:pic>
                   <pic:nvPicPr>
-                    <pic:cNvPr id="0" name="image14.png"/>
+                    <pic:cNvPr id="0" name="image7.png"/>
                     <pic:cNvPicPr preferRelativeResize="0"/>
                   </pic:nvPicPr>
                   <pic:blipFill>
@@ -16767,12 +16856,12 @@
           <wp:inline distB="114300" distT="114300" distL="114300" distR="114300">
             <wp:extent cx="5399730" cy="2260600"/>
             <wp:effectExtent b="25400" l="25400" r="25400" t="25400"/>
-            <wp:docPr id="1" name="image12.png"/>
+            <wp:docPr id="1" name="image6.png"/>
             <a:graphic>
               <a:graphicData uri="http://schemas.openxmlformats.org/drawingml/2006/picture">
                 <pic:pic>
                   <pic:nvPicPr>
-                    <pic:cNvPr id="0" name="image12.png"/>
+                    <pic:cNvPr id="0" name="image6.png"/>
                     <pic:cNvPicPr preferRelativeResize="0"/>
                   </pic:nvPicPr>
                   <pic:blipFill>
@@ -16852,12 +16941,12 @@
           <wp:inline distB="114300" distT="114300" distL="114300" distR="114300">
             <wp:extent cx="5019675" cy="3429000"/>
             <wp:effectExtent b="25400" l="25400" r="25400" t="25400"/>
-            <wp:docPr id="6" name="image4.png"/>
+            <wp:docPr id="6" name="image17.png"/>
             <a:graphic>
               <a:graphicData uri="http://schemas.openxmlformats.org/drawingml/2006/picture">
                 <pic:pic>
                   <pic:nvPicPr>
-                    <pic:cNvPr id="0" name="image4.png"/>
+                    <pic:cNvPr id="0" name="image17.png"/>
                     <pic:cNvPicPr preferRelativeResize="0"/>
                   </pic:nvPicPr>
                   <pic:blipFill>

</xml_diff>

<commit_message>
Actualizacion de FD03 #7
</commit_message>
<xml_diff>
--- a/FD03-EPIS-Informe Especificación Requerimientos.docx
+++ b/FD03-EPIS-Informe Especificación Requerimientos.docx
@@ -2109,7 +2109,7 @@
     </w:p>
     <w:sdt>
       <w:sdtPr>
-        <w:id w:val="-1564910427"/>
+        <w:id w:val="-1469446629"/>
         <w:docPartObj>
           <w:docPartGallery w:val="Table of Contents"/>
           <w:docPartUnique w:val="1"/>
@@ -3484,7 +3484,7 @@
               </w:rPr>
               <w:t xml:space="preserve">3. Modelo Lógico</w:t>
               <w:tab/>
-              <w:t xml:space="preserve">22</w:t>
+              <w:t xml:space="preserve">24</w:t>
             </w:r>
           </w:hyperlink>
           <w:r>
@@ -3537,7 +3537,7 @@
               </w:rPr>
               <w:t xml:space="preserve">a) Análisis de Objetos</w:t>
               <w:tab/>
-              <w:t xml:space="preserve">22</w:t>
+              <w:t xml:space="preserve">24</w:t>
             </w:r>
           </w:hyperlink>
           <w:r>
@@ -3590,7 +3590,7 @@
               </w:rPr>
               <w:t xml:space="preserve">b) Diagrama de Actividades con objetos</w:t>
               <w:tab/>
-              <w:t xml:space="preserve">23</w:t>
+              <w:t xml:space="preserve">25</w:t>
             </w:r>
           </w:hyperlink>
           <w:r>
@@ -3643,7 +3643,7 @@
               </w:rPr>
               <w:t xml:space="preserve">c) Diagrama de Secuencia</w:t>
               <w:tab/>
-              <w:t xml:space="preserve">29</w:t>
+              <w:t xml:space="preserve">31</w:t>
             </w:r>
           </w:hyperlink>
           <w:r>
@@ -3696,7 +3696,7 @@
               </w:rPr>
               <w:t xml:space="preserve">d) Diagrama de Clases</w:t>
               <w:tab/>
-              <w:t xml:space="preserve">32</w:t>
+              <w:t xml:space="preserve">34</w:t>
             </w:r>
           </w:hyperlink>
           <w:r>
@@ -3748,7 +3748,7 @@
               </w:rPr>
               <w:t xml:space="preserve">CONCLUSIONES</w:t>
               <w:tab/>
-              <w:t xml:space="preserve">32</w:t>
+              <w:t xml:space="preserve">34</w:t>
             </w:r>
           </w:hyperlink>
           <w:r>
@@ -3800,7 +3800,7 @@
               </w:rPr>
               <w:t xml:space="preserve">RECOMENDACIONES</w:t>
               <w:tab/>
-              <w:t xml:space="preserve">33</w:t>
+              <w:t xml:space="preserve">35</w:t>
             </w:r>
           </w:hyperlink>
           <w:r>
@@ -3852,7 +3852,7 @@
               </w:rPr>
               <w:t xml:space="preserve">BIBLIOGRAFÍA</w:t>
               <w:tab/>
-              <w:t xml:space="preserve">33</w:t>
+              <w:t xml:space="preserve">35</w:t>
             </w:r>
           </w:hyperlink>
           <w:r>
@@ -4883,12 +4883,12 @@
           <wp:inline distB="114300" distT="114300" distL="114300" distR="114300">
             <wp:extent cx="4592775" cy="5629592"/>
             <wp:effectExtent b="25400" l="25400" r="25400" t="25400"/>
-            <wp:docPr id="7" name="image14.png"/>
+            <wp:docPr id="7" name="image10.png"/>
             <a:graphic>
               <a:graphicData uri="http://schemas.openxmlformats.org/drawingml/2006/picture">
                 <pic:pic>
                   <pic:nvPicPr>
-                    <pic:cNvPr id="0" name="image14.png"/>
+                    <pic:cNvPr id="0" name="image10.png"/>
                     <pic:cNvPicPr preferRelativeResize="0"/>
                   </pic:nvPicPr>
                   <pic:blipFill>
@@ -5027,7 +5027,7 @@
     <w:sdt>
       <w:sdtPr>
         <w:lock w:val="contentLocked"/>
-        <w:id w:val="-151484784"/>
+        <w:id w:val="902206794"/>
         <w:tag w:val="goog_rdk_0"/>
       </w:sdtPr>
       <w:sdtContent>
@@ -8028,12 +8028,12 @@
           <wp:inline distB="114300" distT="114300" distL="114300" distR="114300">
             <wp:extent cx="5399730" cy="3670300"/>
             <wp:effectExtent b="25400" l="25400" r="25400" t="25400"/>
-            <wp:docPr id="13" name="image10.png"/>
+            <wp:docPr id="13" name="image17.png"/>
             <a:graphic>
               <a:graphicData uri="http://schemas.openxmlformats.org/drawingml/2006/picture">
                 <pic:pic>
                   <pic:nvPicPr>
-                    <pic:cNvPr id="0" name="image10.png"/>
+                    <pic:cNvPr id="0" name="image17.png"/>
                     <pic:cNvPicPr preferRelativeResize="0"/>
                   </pic:nvPicPr>
                   <pic:blipFill>
@@ -8129,12 +8129,12 @@
           <wp:inline distB="114300" distT="114300" distL="114300" distR="114300">
             <wp:extent cx="3752850" cy="5133975"/>
             <wp:effectExtent b="0" l="0" r="0" t="0"/>
-            <wp:docPr id="10" name="image2.png"/>
+            <wp:docPr id="10" name="image8.png"/>
             <a:graphic>
               <a:graphicData uri="http://schemas.openxmlformats.org/drawingml/2006/picture">
                 <pic:pic>
                   <pic:nvPicPr>
-                    <pic:cNvPr id="0" name="image2.png"/>
+                    <pic:cNvPr id="0" name="image8.png"/>
                     <pic:cNvPicPr preferRelativeResize="0"/>
                   </pic:nvPicPr>
                   <pic:blipFill>
@@ -8329,7 +8329,7 @@
     <w:sdt>
       <w:sdtPr>
         <w:lock w:val="contentLocked"/>
-        <w:id w:val="1402165593"/>
+        <w:id w:val="-1116793922"/>
         <w:tag w:val="goog_rdk_1"/>
       </w:sdtPr>
       <w:sdtContent>
@@ -8667,6 +8667,251 @@
           <w:tr>
             <w:trPr>
               <w:cantSplit w:val="0"/>
+              <w:trHeight w:val="1005" w:hRule="atLeast"/>
+              <w:tblHeader w:val="0"/>
+            </w:trPr>
+            <w:tc>
+              <w:tcPr>
+                <w:tcBorders>
+                  <w:top w:color="000000" w:space="0" w:sz="0" w:val="nil"/>
+                  <w:left w:color="000000" w:space="0" w:sz="5" w:val="single"/>
+                  <w:bottom w:color="000000" w:space="0" w:sz="5" w:val="single"/>
+                  <w:right w:color="000000" w:space="0" w:sz="5" w:val="single"/>
+                </w:tcBorders>
+                <w:shd w:fill="auto" w:val="clear"/>
+                <w:tcMar>
+                  <w:top w:w="100.0" w:type="dxa"/>
+                  <w:left w:w="100.0" w:type="dxa"/>
+                  <w:bottom w:w="100.0" w:type="dxa"/>
+                  <w:right w:w="100.0" w:type="dxa"/>
+                </w:tcMar>
+                <w:vAlign w:val="top"/>
+              </w:tcPr>
+              <w:p>
+                <w:pPr>
+                  <w:spacing w:after="0" w:before="240" w:line="360" w:lineRule="auto"/>
+                  <w:rPr>
+                    <w:rFonts w:ascii="Times New Roman" w:cs="Times New Roman" w:eastAsia="Times New Roman" w:hAnsi="Times New Roman"/>
+                    <w:b w:val="1"/>
+                    <w:bCs w:val="1"/>
+                    <w:sz w:val="24"/>
+                    <w:szCs w:val="24"/>
+                  </w:rPr>
+                </w:pPr>
+                <w:r>
+                  <w:rPr>
+                    <w:rFonts w:ascii="Times New Roman" w:cs="Times New Roman" w:eastAsia="Times New Roman" w:hAnsi="Times New Roman"/>
+                    <w:b w:val="1"/>
+                    <w:bCs w:val="1"/>
+                    <w:sz w:val="24"/>
+                    <w:szCs w:val="24"/>
+                    <w:rtl w:val="0"/>
+                  </w:rPr>
+                  <w:t xml:space="preserve">Historia de Usuario</w:t>
+                </w:r>
+              </w:p>
+            </w:tc>
+            <w:tc>
+              <w:tcPr>
+                <w:tcBorders>
+                  <w:top w:color="000000" w:space="0" w:sz="0" w:val="nil"/>
+                  <w:left w:color="000000" w:space="0" w:sz="0" w:val="nil"/>
+                  <w:bottom w:color="000000" w:space="0" w:sz="5" w:val="single"/>
+                  <w:right w:color="000000" w:space="0" w:sz="5" w:val="single"/>
+                </w:tcBorders>
+                <w:shd w:fill="auto" w:val="clear"/>
+                <w:tcMar>
+                  <w:top w:w="100.0" w:type="dxa"/>
+                  <w:left w:w="100.0" w:type="dxa"/>
+                  <w:bottom w:w="100.0" w:type="dxa"/>
+                  <w:right w:w="100.0" w:type="dxa"/>
+                </w:tcMar>
+                <w:vAlign w:val="top"/>
+              </w:tcPr>
+              <w:p>
+                <w:pPr>
+                  <w:spacing w:after="0" w:before="240" w:line="360" w:lineRule="auto"/>
+                  <w:jc w:val="both"/>
+                  <w:rPr>
+                    <w:rFonts w:ascii="Times New Roman" w:cs="Times New Roman" w:eastAsia="Times New Roman" w:hAnsi="Times New Roman"/>
+                    <w:sz w:val="24"/>
+                    <w:szCs w:val="24"/>
+                  </w:rPr>
+                </w:pPr>
+                <w:r>
+                  <w:rPr>
+                    <w:rFonts w:ascii="Times New Roman" w:cs="Times New Roman" w:eastAsia="Times New Roman" w:hAnsi="Times New Roman"/>
+                    <w:sz w:val="24"/>
+                    <w:szCs w:val="24"/>
+                    <w:rtl w:val="0"/>
+                  </w:rPr>
+                  <w:t xml:space="preserve">Como estudiante, quiero realizar una búsqueda única en una sola barra, para encontrar libros físicos y digitales al mismo tiempo.</w:t>
+                </w:r>
+              </w:p>
+            </w:tc>
+          </w:tr>
+          <w:tr>
+            <w:trPr>
+              <w:cantSplit w:val="0"/>
+              <w:trHeight w:val="1005" w:hRule="atLeast"/>
+              <w:tblHeader w:val="0"/>
+            </w:trPr>
+            <w:tc>
+              <w:tcPr>
+                <w:tcBorders>
+                  <w:top w:color="000000" w:space="0" w:sz="0" w:val="nil"/>
+                  <w:left w:color="000000" w:space="0" w:sz="5" w:val="single"/>
+                  <w:bottom w:color="000000" w:space="0" w:sz="5" w:val="single"/>
+                  <w:right w:color="000000" w:space="0" w:sz="5" w:val="single"/>
+                </w:tcBorders>
+                <w:shd w:fill="auto" w:val="clear"/>
+                <w:tcMar>
+                  <w:top w:w="100.0" w:type="dxa"/>
+                  <w:left w:w="100.0" w:type="dxa"/>
+                  <w:bottom w:w="100.0" w:type="dxa"/>
+                  <w:right w:w="100.0" w:type="dxa"/>
+                </w:tcMar>
+                <w:vAlign w:val="top"/>
+              </w:tcPr>
+              <w:p>
+                <w:pPr>
+                  <w:spacing w:after="0" w:before="240" w:line="360" w:lineRule="auto"/>
+                  <w:rPr>
+                    <w:rFonts w:ascii="Times New Roman" w:cs="Times New Roman" w:eastAsia="Times New Roman" w:hAnsi="Times New Roman"/>
+                    <w:b w:val="1"/>
+                    <w:bCs w:val="1"/>
+                    <w:sz w:val="24"/>
+                    <w:szCs w:val="24"/>
+                  </w:rPr>
+                </w:pPr>
+                <w:r>
+                  <w:rPr>
+                    <w:rFonts w:ascii="Times New Roman" w:cs="Times New Roman" w:eastAsia="Times New Roman" w:hAnsi="Times New Roman"/>
+                    <w:b w:val="1"/>
+                    <w:bCs w:val="1"/>
+                    <w:sz w:val="24"/>
+                    <w:szCs w:val="24"/>
+                    <w:rtl w:val="0"/>
+                  </w:rPr>
+                  <w:t xml:space="preserve">Escenario (Gherkin)</w:t>
+                </w:r>
+              </w:p>
+            </w:tc>
+            <w:tc>
+              <w:tcPr>
+                <w:tcBorders>
+                  <w:top w:color="000000" w:space="0" w:sz="0" w:val="nil"/>
+                  <w:left w:color="000000" w:space="0" w:sz="0" w:val="nil"/>
+                  <w:bottom w:color="000000" w:space="0" w:sz="5" w:val="single"/>
+                  <w:right w:color="000000" w:space="0" w:sz="5" w:val="single"/>
+                </w:tcBorders>
+                <w:shd w:fill="auto" w:val="clear"/>
+                <w:tcMar>
+                  <w:top w:w="100.0" w:type="dxa"/>
+                  <w:left w:w="100.0" w:type="dxa"/>
+                  <w:bottom w:w="100.0" w:type="dxa"/>
+                  <w:right w:w="100.0" w:type="dxa"/>
+                </w:tcMar>
+                <w:vAlign w:val="top"/>
+              </w:tcPr>
+              <w:p>
+                <w:pPr>
+                  <w:spacing w:after="0" w:before="240" w:line="360" w:lineRule="auto"/>
+                  <w:jc w:val="both"/>
+                  <w:rPr>
+                    <w:rFonts w:ascii="Times New Roman" w:cs="Times New Roman" w:eastAsia="Times New Roman" w:hAnsi="Times New Roman"/>
+                    <w:sz w:val="24"/>
+                    <w:szCs w:val="24"/>
+                  </w:rPr>
+                </w:pPr>
+                <w:r>
+                  <w:rPr>
+                    <w:rFonts w:ascii="Times New Roman" w:cs="Times New Roman" w:eastAsia="Times New Roman" w:hAnsi="Times New Roman"/>
+                    <w:b w:val="1"/>
+                    <w:bCs w:val="1"/>
+                    <w:sz w:val="24"/>
+                    <w:szCs w:val="24"/>
+                    <w:rtl w:val="0"/>
+                  </w:rPr>
+                  <w:t xml:space="preserve">Dado</w:t>
+                </w:r>
+                <w:r>
+                  <w:rPr>
+                    <w:rFonts w:ascii="Times New Roman" w:cs="Times New Roman" w:eastAsia="Times New Roman" w:hAnsi="Times New Roman"/>
+                    <w:sz w:val="24"/>
+                    <w:szCs w:val="24"/>
+                    <w:rtl w:val="0"/>
+                  </w:rPr>
+                  <w:t xml:space="preserve"> que el usuario se encuentra en la interfaz de búsqueda principal.</w:t>
+                </w:r>
+              </w:p>
+              <w:p>
+                <w:pPr>
+                  <w:spacing w:after="0" w:before="240" w:line="360" w:lineRule="auto"/>
+                  <w:jc w:val="both"/>
+                  <w:rPr>
+                    <w:rFonts w:ascii="Times New Roman" w:cs="Times New Roman" w:eastAsia="Times New Roman" w:hAnsi="Times New Roman"/>
+                    <w:sz w:val="24"/>
+                    <w:szCs w:val="24"/>
+                  </w:rPr>
+                </w:pPr>
+                <w:r>
+                  <w:rPr>
+                    <w:rFonts w:ascii="Times New Roman" w:cs="Times New Roman" w:eastAsia="Times New Roman" w:hAnsi="Times New Roman"/>
+                    <w:b w:val="1"/>
+                    <w:bCs w:val="1"/>
+                    <w:sz w:val="24"/>
+                    <w:szCs w:val="24"/>
+                    <w:rtl w:val="0"/>
+                  </w:rPr>
+                  <w:t xml:space="preserve">Cuando</w:t>
+                </w:r>
+                <w:r>
+                  <w:rPr>
+                    <w:rFonts w:ascii="Times New Roman" w:cs="Times New Roman" w:eastAsia="Times New Roman" w:hAnsi="Times New Roman"/>
+                    <w:sz w:val="24"/>
+                    <w:szCs w:val="24"/>
+                    <w:rtl w:val="0"/>
+                  </w:rPr>
+                  <w:t xml:space="preserve"> ingresa un término de búsqueda (título, autor o ISBN) y presiona el botón "Buscar".</w:t>
+                </w:r>
+              </w:p>
+              <w:p>
+                <w:pPr>
+                  <w:spacing w:after="0" w:before="240" w:line="360" w:lineRule="auto"/>
+                  <w:jc w:val="both"/>
+                  <w:rPr>
+                    <w:rFonts w:ascii="Times New Roman" w:cs="Times New Roman" w:eastAsia="Times New Roman" w:hAnsi="Times New Roman"/>
+                    <w:sz w:val="24"/>
+                    <w:szCs w:val="24"/>
+                  </w:rPr>
+                </w:pPr>
+                <w:r>
+                  <w:rPr>
+                    <w:rFonts w:ascii="Times New Roman" w:cs="Times New Roman" w:eastAsia="Times New Roman" w:hAnsi="Times New Roman"/>
+                    <w:b w:val="1"/>
+                    <w:bCs w:val="1"/>
+                    <w:sz w:val="24"/>
+                    <w:szCs w:val="24"/>
+                    <w:rtl w:val="0"/>
+                  </w:rPr>
+                  <w:t xml:space="preserve">Entonces</w:t>
+                </w:r>
+                <w:r>
+                  <w:rPr>
+                    <w:rFonts w:ascii="Times New Roman" w:cs="Times New Roman" w:eastAsia="Times New Roman" w:hAnsi="Times New Roman"/>
+                    <w:sz w:val="24"/>
+                    <w:szCs w:val="24"/>
+                    <w:rtl w:val="0"/>
+                  </w:rPr>
+                  <w:t xml:space="preserve"> el sistema debe presentar una lista combinada con resultados del inventario local (MySQL) y la Google Books API.</w:t>
+                </w:r>
+              </w:p>
+            </w:tc>
+          </w:tr>
+          <w:tr>
+            <w:trPr>
+              <w:cantSplit w:val="0"/>
               <w:trHeight w:val="1755" w:hRule="atLeast"/>
               <w:tblHeader w:val="0"/>
             </w:trPr>
@@ -9111,79 +9356,6 @@
               </w:tcPr>
               <w:p>
                 <w:pPr>
-                  <w:spacing w:after="0" w:before="240" w:line="360" w:lineRule="auto"/>
-                  <w:rPr>
-                    <w:rFonts w:ascii="Times New Roman" w:cs="Times New Roman" w:eastAsia="Times New Roman" w:hAnsi="Times New Roman"/>
-                    <w:sz w:val="24"/>
-                    <w:szCs w:val="24"/>
-                  </w:rPr>
-                </w:pPr>
-                <w:r>
-                  <w:rPr>
-                    <w:rtl w:val="0"/>
-                  </w:rPr>
-                </w:r>
-              </w:p>
-            </w:tc>
-          </w:tr>
-          <w:tr>
-            <w:trPr>
-              <w:cantSplit w:val="0"/>
-              <w:trHeight w:val="1275" w:hRule="atLeast"/>
-              <w:tblHeader w:val="0"/>
-            </w:trPr>
-            <w:tc>
-              <w:tcPr>
-                <w:tcBorders>
-                  <w:top w:color="000000" w:space="0" w:sz="0" w:val="nil"/>
-                  <w:left w:color="000000" w:space="0" w:sz="5" w:val="single"/>
-                  <w:bottom w:color="000000" w:space="0" w:sz="5" w:val="single"/>
-                  <w:right w:color="000000" w:space="0" w:sz="5" w:val="single"/>
-                </w:tcBorders>
-                <w:shd w:fill="auto" w:val="clear"/>
-                <w:tcMar>
-                  <w:top w:w="100.0" w:type="dxa"/>
-                  <w:left w:w="100.0" w:type="dxa"/>
-                  <w:bottom w:w="100.0" w:type="dxa"/>
-                  <w:right w:w="100.0" w:type="dxa"/>
-                </w:tcMar>
-                <w:vAlign w:val="top"/>
-              </w:tcPr>
-              <w:p>
-                <w:pPr>
-                  <w:spacing w:after="0" w:before="240" w:line="360" w:lineRule="auto"/>
-                  <w:rPr>
-                    <w:rFonts w:ascii="Times New Roman" w:cs="Times New Roman" w:eastAsia="Times New Roman" w:hAnsi="Times New Roman"/>
-                    <w:sz w:val="24"/>
-                    <w:szCs w:val="24"/>
-                  </w:rPr>
-                </w:pPr>
-                <w:r>
-                  <w:rPr>
-                    <w:rtl w:val="0"/>
-                  </w:rPr>
-                </w:r>
-              </w:p>
-            </w:tc>
-            <w:tc>
-              <w:tcPr>
-                <w:tcBorders>
-                  <w:top w:color="000000" w:space="0" w:sz="0" w:val="nil"/>
-                  <w:left w:color="000000" w:space="0" w:sz="0" w:val="nil"/>
-                  <w:bottom w:color="000000" w:space="0" w:sz="5" w:val="single"/>
-                  <w:right w:color="000000" w:space="0" w:sz="5" w:val="single"/>
-                </w:tcBorders>
-                <w:shd w:fill="auto" w:val="clear"/>
-                <w:tcMar>
-                  <w:top w:w="100.0" w:type="dxa"/>
-                  <w:left w:w="100.0" w:type="dxa"/>
-                  <w:bottom w:w="100.0" w:type="dxa"/>
-                  <w:right w:w="100.0" w:type="dxa"/>
-                </w:tcMar>
-                <w:vAlign w:val="top"/>
-              </w:tcPr>
-              <w:p>
-                <w:pPr>
                   <w:spacing w:after="240" w:before="240" w:line="360" w:lineRule="auto"/>
                   <w:rPr>
                     <w:rFonts w:ascii="Times New Roman" w:cs="Times New Roman" w:eastAsia="Times New Roman" w:hAnsi="Times New Roman"/>
@@ -9404,7 +9576,7 @@
     <w:sdt>
       <w:sdtPr>
         <w:lock w:val="contentLocked"/>
-        <w:id w:val="1279317165"/>
+        <w:id w:val="611220830"/>
         <w:tag w:val="goog_rdk_2"/>
       </w:sdtPr>
       <w:sdtContent>
@@ -9742,6 +9914,251 @@
           <w:tr>
             <w:trPr>
               <w:cantSplit w:val="0"/>
+              <w:trHeight w:val="1005" w:hRule="atLeast"/>
+              <w:tblHeader w:val="0"/>
+            </w:trPr>
+            <w:tc>
+              <w:tcPr>
+                <w:tcBorders>
+                  <w:top w:color="000000" w:space="0" w:sz="0" w:val="nil"/>
+                  <w:left w:color="000000" w:space="0" w:sz="5" w:val="single"/>
+                  <w:bottom w:color="000000" w:space="0" w:sz="5" w:val="single"/>
+                  <w:right w:color="000000" w:space="0" w:sz="5" w:val="single"/>
+                </w:tcBorders>
+                <w:shd w:fill="auto" w:val="clear"/>
+                <w:tcMar>
+                  <w:top w:w="100.0" w:type="dxa"/>
+                  <w:left w:w="100.0" w:type="dxa"/>
+                  <w:bottom w:w="100.0" w:type="dxa"/>
+                  <w:right w:w="100.0" w:type="dxa"/>
+                </w:tcMar>
+                <w:vAlign w:val="top"/>
+              </w:tcPr>
+              <w:p>
+                <w:pPr>
+                  <w:spacing w:after="0" w:before="240" w:line="360" w:lineRule="auto"/>
+                  <w:rPr>
+                    <w:rFonts w:ascii="Times New Roman" w:cs="Times New Roman" w:eastAsia="Times New Roman" w:hAnsi="Times New Roman"/>
+                    <w:b w:val="1"/>
+                    <w:bCs w:val="1"/>
+                    <w:sz w:val="24"/>
+                    <w:szCs w:val="24"/>
+                  </w:rPr>
+                </w:pPr>
+                <w:r>
+                  <w:rPr>
+                    <w:rFonts w:ascii="Times New Roman" w:cs="Times New Roman" w:eastAsia="Times New Roman" w:hAnsi="Times New Roman"/>
+                    <w:b w:val="1"/>
+                    <w:bCs w:val="1"/>
+                    <w:sz w:val="24"/>
+                    <w:szCs w:val="24"/>
+                    <w:rtl w:val="0"/>
+                  </w:rPr>
+                  <w:t xml:space="preserve">Historia de Usuario</w:t>
+                </w:r>
+              </w:p>
+            </w:tc>
+            <w:tc>
+              <w:tcPr>
+                <w:tcBorders>
+                  <w:top w:color="000000" w:space="0" w:sz="0" w:val="nil"/>
+                  <w:left w:color="000000" w:space="0" w:sz="0" w:val="nil"/>
+                  <w:bottom w:color="000000" w:space="0" w:sz="5" w:val="single"/>
+                  <w:right w:color="000000" w:space="0" w:sz="5" w:val="single"/>
+                </w:tcBorders>
+                <w:shd w:fill="auto" w:val="clear"/>
+                <w:tcMar>
+                  <w:top w:w="100.0" w:type="dxa"/>
+                  <w:left w:w="100.0" w:type="dxa"/>
+                  <w:bottom w:w="100.0" w:type="dxa"/>
+                  <w:right w:w="100.0" w:type="dxa"/>
+                </w:tcMar>
+                <w:vAlign w:val="top"/>
+              </w:tcPr>
+              <w:p>
+                <w:pPr>
+                  <w:spacing w:after="0" w:before="240" w:line="360" w:lineRule="auto"/>
+                  <w:jc w:val="both"/>
+                  <w:rPr>
+                    <w:rFonts w:ascii="Times New Roman" w:cs="Times New Roman" w:eastAsia="Times New Roman" w:hAnsi="Times New Roman"/>
+                    <w:sz w:val="24"/>
+                    <w:szCs w:val="24"/>
+                  </w:rPr>
+                </w:pPr>
+                <w:r>
+                  <w:rPr>
+                    <w:rFonts w:ascii="Times New Roman" w:cs="Times New Roman" w:eastAsia="Times New Roman" w:hAnsi="Times New Roman"/>
+                    <w:sz w:val="24"/>
+                    <w:szCs w:val="24"/>
+                    <w:rtl w:val="0"/>
+                  </w:rPr>
+                  <w:t xml:space="preserve">Como investigador, quiero ver la ficha técnica completa de un libro, para determinar si el recurso es relevante para mi trabajo académico.</w:t>
+                </w:r>
+              </w:p>
+            </w:tc>
+          </w:tr>
+          <w:tr>
+            <w:trPr>
+              <w:cantSplit w:val="0"/>
+              <w:trHeight w:val="1005" w:hRule="atLeast"/>
+              <w:tblHeader w:val="0"/>
+            </w:trPr>
+            <w:tc>
+              <w:tcPr>
+                <w:tcBorders>
+                  <w:top w:color="000000" w:space="0" w:sz="0" w:val="nil"/>
+                  <w:left w:color="000000" w:space="0" w:sz="5" w:val="single"/>
+                  <w:bottom w:color="000000" w:space="0" w:sz="5" w:val="single"/>
+                  <w:right w:color="000000" w:space="0" w:sz="5" w:val="single"/>
+                </w:tcBorders>
+                <w:shd w:fill="auto" w:val="clear"/>
+                <w:tcMar>
+                  <w:top w:w="100.0" w:type="dxa"/>
+                  <w:left w:w="100.0" w:type="dxa"/>
+                  <w:bottom w:w="100.0" w:type="dxa"/>
+                  <w:right w:w="100.0" w:type="dxa"/>
+                </w:tcMar>
+                <w:vAlign w:val="top"/>
+              </w:tcPr>
+              <w:p>
+                <w:pPr>
+                  <w:spacing w:after="0" w:before="240" w:line="360" w:lineRule="auto"/>
+                  <w:rPr>
+                    <w:rFonts w:ascii="Times New Roman" w:cs="Times New Roman" w:eastAsia="Times New Roman" w:hAnsi="Times New Roman"/>
+                    <w:b w:val="1"/>
+                    <w:bCs w:val="1"/>
+                    <w:sz w:val="24"/>
+                    <w:szCs w:val="24"/>
+                  </w:rPr>
+                </w:pPr>
+                <w:r>
+                  <w:rPr>
+                    <w:rFonts w:ascii="Times New Roman" w:cs="Times New Roman" w:eastAsia="Times New Roman" w:hAnsi="Times New Roman"/>
+                    <w:b w:val="1"/>
+                    <w:bCs w:val="1"/>
+                    <w:sz w:val="24"/>
+                    <w:szCs w:val="24"/>
+                    <w:rtl w:val="0"/>
+                  </w:rPr>
+                  <w:t xml:space="preserve">Escenario (Gherkin)</w:t>
+                </w:r>
+              </w:p>
+            </w:tc>
+            <w:tc>
+              <w:tcPr>
+                <w:tcBorders>
+                  <w:top w:color="000000" w:space="0" w:sz="0" w:val="nil"/>
+                  <w:left w:color="000000" w:space="0" w:sz="0" w:val="nil"/>
+                  <w:bottom w:color="000000" w:space="0" w:sz="5" w:val="single"/>
+                  <w:right w:color="000000" w:space="0" w:sz="5" w:val="single"/>
+                </w:tcBorders>
+                <w:shd w:fill="auto" w:val="clear"/>
+                <w:tcMar>
+                  <w:top w:w="100.0" w:type="dxa"/>
+                  <w:left w:w="100.0" w:type="dxa"/>
+                  <w:bottom w:w="100.0" w:type="dxa"/>
+                  <w:right w:w="100.0" w:type="dxa"/>
+                </w:tcMar>
+                <w:vAlign w:val="top"/>
+              </w:tcPr>
+              <w:p>
+                <w:pPr>
+                  <w:spacing w:after="0" w:before="240" w:line="360" w:lineRule="auto"/>
+                  <w:jc w:val="both"/>
+                  <w:rPr>
+                    <w:rFonts w:ascii="Times New Roman" w:cs="Times New Roman" w:eastAsia="Times New Roman" w:hAnsi="Times New Roman"/>
+                    <w:sz w:val="24"/>
+                    <w:szCs w:val="24"/>
+                  </w:rPr>
+                </w:pPr>
+                <w:r>
+                  <w:rPr>
+                    <w:rFonts w:ascii="Times New Roman" w:cs="Times New Roman" w:eastAsia="Times New Roman" w:hAnsi="Times New Roman"/>
+                    <w:b w:val="1"/>
+                    <w:bCs w:val="1"/>
+                    <w:sz w:val="24"/>
+                    <w:szCs w:val="24"/>
+                    <w:rtl w:val="0"/>
+                  </w:rPr>
+                  <w:t xml:space="preserve">Dado</w:t>
+                </w:r>
+                <w:r>
+                  <w:rPr>
+                    <w:rFonts w:ascii="Times New Roman" w:cs="Times New Roman" w:eastAsia="Times New Roman" w:hAnsi="Times New Roman"/>
+                    <w:sz w:val="24"/>
+                    <w:szCs w:val="24"/>
+                    <w:rtl w:val="0"/>
+                  </w:rPr>
+                  <w:t xml:space="preserve"> que el usuario ha obtenido una lista de resultados de búsqueda.</w:t>
+                </w:r>
+              </w:p>
+              <w:p>
+                <w:pPr>
+                  <w:spacing w:after="0" w:before="240" w:line="360" w:lineRule="auto"/>
+                  <w:jc w:val="both"/>
+                  <w:rPr>
+                    <w:rFonts w:ascii="Times New Roman" w:cs="Times New Roman" w:eastAsia="Times New Roman" w:hAnsi="Times New Roman"/>
+                    <w:sz w:val="24"/>
+                    <w:szCs w:val="24"/>
+                  </w:rPr>
+                </w:pPr>
+                <w:r>
+                  <w:rPr>
+                    <w:rFonts w:ascii="Times New Roman" w:cs="Times New Roman" w:eastAsia="Times New Roman" w:hAnsi="Times New Roman"/>
+                    <w:b w:val="1"/>
+                    <w:bCs w:val="1"/>
+                    <w:sz w:val="24"/>
+                    <w:szCs w:val="24"/>
+                    <w:rtl w:val="0"/>
+                  </w:rPr>
+                  <w:t xml:space="preserve">Cuando</w:t>
+                </w:r>
+                <w:r>
+                  <w:rPr>
+                    <w:rFonts w:ascii="Times New Roman" w:cs="Times New Roman" w:eastAsia="Times New Roman" w:hAnsi="Times New Roman"/>
+                    <w:sz w:val="24"/>
+                    <w:szCs w:val="24"/>
+                    <w:rtl w:val="0"/>
+                  </w:rPr>
+                  <w:t xml:space="preserve"> hace clic sobre un libro específico de la lista.</w:t>
+                </w:r>
+              </w:p>
+              <w:p>
+                <w:pPr>
+                  <w:spacing w:after="0" w:before="240" w:line="360" w:lineRule="auto"/>
+                  <w:jc w:val="both"/>
+                  <w:rPr>
+                    <w:rFonts w:ascii="Times New Roman" w:cs="Times New Roman" w:eastAsia="Times New Roman" w:hAnsi="Times New Roman"/>
+                    <w:sz w:val="24"/>
+                    <w:szCs w:val="24"/>
+                  </w:rPr>
+                </w:pPr>
+                <w:r>
+                  <w:rPr>
+                    <w:rFonts w:ascii="Times New Roman" w:cs="Times New Roman" w:eastAsia="Times New Roman" w:hAnsi="Times New Roman"/>
+                    <w:b w:val="1"/>
+                    <w:bCs w:val="1"/>
+                    <w:sz w:val="24"/>
+                    <w:szCs w:val="24"/>
+                    <w:rtl w:val="0"/>
+                  </w:rPr>
+                  <w:t xml:space="preserve">Entonces</w:t>
+                </w:r>
+                <w:r>
+                  <w:rPr>
+                    <w:rFonts w:ascii="Times New Roman" w:cs="Times New Roman" w:eastAsia="Times New Roman" w:hAnsi="Times New Roman"/>
+                    <w:sz w:val="24"/>
+                    <w:szCs w:val="24"/>
+                    <w:rtl w:val="0"/>
+                  </w:rPr>
+                  <w:t xml:space="preserve"> el sistema despliega la portada, la sinopsis detallada de Google y los datos de ubicación física integrados en una sola vista.</w:t>
+                </w:r>
+              </w:p>
+            </w:tc>
+          </w:tr>
+          <w:tr>
+            <w:trPr>
+              <w:cantSplit w:val="0"/>
               <w:trHeight w:val="1755" w:hRule="atLeast"/>
               <w:tblHeader w:val="0"/>
             </w:trPr>
@@ -10333,7 +10750,7 @@
     <w:sdt>
       <w:sdtPr>
         <w:lock w:val="contentLocked"/>
-        <w:id w:val="1142151055"/>
+        <w:id w:val="832388612"/>
         <w:tag w:val="goog_rdk_3"/>
       </w:sdtPr>
       <w:sdtContent>
@@ -10671,6 +11088,251 @@
           <w:tr>
             <w:trPr>
               <w:cantSplit w:val="0"/>
+              <w:trHeight w:val="1005" w:hRule="atLeast"/>
+              <w:tblHeader w:val="0"/>
+            </w:trPr>
+            <w:tc>
+              <w:tcPr>
+                <w:tcBorders>
+                  <w:top w:color="000000" w:space="0" w:sz="0" w:val="nil"/>
+                  <w:left w:color="000000" w:space="0" w:sz="5" w:val="single"/>
+                  <w:bottom w:color="000000" w:space="0" w:sz="5" w:val="single"/>
+                  <w:right w:color="000000" w:space="0" w:sz="5" w:val="single"/>
+                </w:tcBorders>
+                <w:shd w:fill="auto" w:val="clear"/>
+                <w:tcMar>
+                  <w:top w:w="100.0" w:type="dxa"/>
+                  <w:left w:w="100.0" w:type="dxa"/>
+                  <w:bottom w:w="100.0" w:type="dxa"/>
+                  <w:right w:w="100.0" w:type="dxa"/>
+                </w:tcMar>
+                <w:vAlign w:val="top"/>
+              </w:tcPr>
+              <w:p>
+                <w:pPr>
+                  <w:spacing w:after="0" w:before="240" w:line="360" w:lineRule="auto"/>
+                  <w:rPr>
+                    <w:rFonts w:ascii="Times New Roman" w:cs="Times New Roman" w:eastAsia="Times New Roman" w:hAnsi="Times New Roman"/>
+                    <w:b w:val="1"/>
+                    <w:bCs w:val="1"/>
+                    <w:sz w:val="24"/>
+                    <w:szCs w:val="24"/>
+                  </w:rPr>
+                </w:pPr>
+                <w:r>
+                  <w:rPr>
+                    <w:rFonts w:ascii="Times New Roman" w:cs="Times New Roman" w:eastAsia="Times New Roman" w:hAnsi="Times New Roman"/>
+                    <w:b w:val="1"/>
+                    <w:bCs w:val="1"/>
+                    <w:sz w:val="24"/>
+                    <w:szCs w:val="24"/>
+                    <w:rtl w:val="0"/>
+                  </w:rPr>
+                  <w:t xml:space="preserve">Historia de Usuario</w:t>
+                </w:r>
+              </w:p>
+            </w:tc>
+            <w:tc>
+              <w:tcPr>
+                <w:tcBorders>
+                  <w:top w:color="000000" w:space="0" w:sz="0" w:val="nil"/>
+                  <w:left w:color="000000" w:space="0" w:sz="0" w:val="nil"/>
+                  <w:bottom w:color="000000" w:space="0" w:sz="5" w:val="single"/>
+                  <w:right w:color="000000" w:space="0" w:sz="5" w:val="single"/>
+                </w:tcBorders>
+                <w:shd w:fill="auto" w:val="clear"/>
+                <w:tcMar>
+                  <w:top w:w="100.0" w:type="dxa"/>
+                  <w:left w:w="100.0" w:type="dxa"/>
+                  <w:bottom w:w="100.0" w:type="dxa"/>
+                  <w:right w:w="100.0" w:type="dxa"/>
+                </w:tcMar>
+                <w:vAlign w:val="top"/>
+              </w:tcPr>
+              <w:p>
+                <w:pPr>
+                  <w:spacing w:after="0" w:before="240" w:line="360" w:lineRule="auto"/>
+                  <w:jc w:val="both"/>
+                  <w:rPr>
+                    <w:rFonts w:ascii="Times New Roman" w:cs="Times New Roman" w:eastAsia="Times New Roman" w:hAnsi="Times New Roman"/>
+                    <w:sz w:val="24"/>
+                    <w:szCs w:val="24"/>
+                  </w:rPr>
+                </w:pPr>
+                <w:r>
+                  <w:rPr>
+                    <w:rFonts w:ascii="Times New Roman" w:cs="Times New Roman" w:eastAsia="Times New Roman" w:hAnsi="Times New Roman"/>
+                    <w:sz w:val="24"/>
+                    <w:szCs w:val="24"/>
+                    <w:rtl w:val="0"/>
+                  </w:rPr>
+                  <w:t xml:space="preserve">Como estudiante, quiero conocer la disponibilidad real de un libro físico, para evitar traslados innecesarios a la biblioteca si el ejemplar no está en estante.</w:t>
+                </w:r>
+              </w:p>
+            </w:tc>
+          </w:tr>
+          <w:tr>
+            <w:trPr>
+              <w:cantSplit w:val="0"/>
+              <w:trHeight w:val="1005" w:hRule="atLeast"/>
+              <w:tblHeader w:val="0"/>
+            </w:trPr>
+            <w:tc>
+              <w:tcPr>
+                <w:tcBorders>
+                  <w:top w:color="000000" w:space="0" w:sz="0" w:val="nil"/>
+                  <w:left w:color="000000" w:space="0" w:sz="5" w:val="single"/>
+                  <w:bottom w:color="000000" w:space="0" w:sz="5" w:val="single"/>
+                  <w:right w:color="000000" w:space="0" w:sz="5" w:val="single"/>
+                </w:tcBorders>
+                <w:shd w:fill="auto" w:val="clear"/>
+                <w:tcMar>
+                  <w:top w:w="100.0" w:type="dxa"/>
+                  <w:left w:w="100.0" w:type="dxa"/>
+                  <w:bottom w:w="100.0" w:type="dxa"/>
+                  <w:right w:w="100.0" w:type="dxa"/>
+                </w:tcMar>
+                <w:vAlign w:val="top"/>
+              </w:tcPr>
+              <w:p>
+                <w:pPr>
+                  <w:spacing w:after="0" w:before="240" w:line="360" w:lineRule="auto"/>
+                  <w:rPr>
+                    <w:rFonts w:ascii="Times New Roman" w:cs="Times New Roman" w:eastAsia="Times New Roman" w:hAnsi="Times New Roman"/>
+                    <w:b w:val="1"/>
+                    <w:bCs w:val="1"/>
+                    <w:sz w:val="24"/>
+                    <w:szCs w:val="24"/>
+                  </w:rPr>
+                </w:pPr>
+                <w:r>
+                  <w:rPr>
+                    <w:rFonts w:ascii="Times New Roman" w:cs="Times New Roman" w:eastAsia="Times New Roman" w:hAnsi="Times New Roman"/>
+                    <w:b w:val="1"/>
+                    <w:bCs w:val="1"/>
+                    <w:sz w:val="24"/>
+                    <w:szCs w:val="24"/>
+                    <w:rtl w:val="0"/>
+                  </w:rPr>
+                  <w:t xml:space="preserve">Escenario (Gherkin)</w:t>
+                </w:r>
+              </w:p>
+            </w:tc>
+            <w:tc>
+              <w:tcPr>
+                <w:tcBorders>
+                  <w:top w:color="000000" w:space="0" w:sz="0" w:val="nil"/>
+                  <w:left w:color="000000" w:space="0" w:sz="0" w:val="nil"/>
+                  <w:bottom w:color="000000" w:space="0" w:sz="5" w:val="single"/>
+                  <w:right w:color="000000" w:space="0" w:sz="5" w:val="single"/>
+                </w:tcBorders>
+                <w:shd w:fill="auto" w:val="clear"/>
+                <w:tcMar>
+                  <w:top w:w="100.0" w:type="dxa"/>
+                  <w:left w:w="100.0" w:type="dxa"/>
+                  <w:bottom w:w="100.0" w:type="dxa"/>
+                  <w:right w:w="100.0" w:type="dxa"/>
+                </w:tcMar>
+                <w:vAlign w:val="top"/>
+              </w:tcPr>
+              <w:p>
+                <w:pPr>
+                  <w:spacing w:after="0" w:before="240" w:line="360" w:lineRule="auto"/>
+                  <w:jc w:val="both"/>
+                  <w:rPr>
+                    <w:rFonts w:ascii="Times New Roman" w:cs="Times New Roman" w:eastAsia="Times New Roman" w:hAnsi="Times New Roman"/>
+                    <w:sz w:val="24"/>
+                    <w:szCs w:val="24"/>
+                  </w:rPr>
+                </w:pPr>
+                <w:r>
+                  <w:rPr>
+                    <w:rFonts w:ascii="Times New Roman" w:cs="Times New Roman" w:eastAsia="Times New Roman" w:hAnsi="Times New Roman"/>
+                    <w:b w:val="1"/>
+                    <w:bCs w:val="1"/>
+                    <w:sz w:val="24"/>
+                    <w:szCs w:val="24"/>
+                    <w:rtl w:val="0"/>
+                  </w:rPr>
+                  <w:t xml:space="preserve">Dado</w:t>
+                </w:r>
+                <w:r>
+                  <w:rPr>
+                    <w:rFonts w:ascii="Times New Roman" w:cs="Times New Roman" w:eastAsia="Times New Roman" w:hAnsi="Times New Roman"/>
+                    <w:sz w:val="24"/>
+                    <w:szCs w:val="24"/>
+                    <w:rtl w:val="0"/>
+                  </w:rPr>
+                  <w:t xml:space="preserve"> que el usuario visualiza los detalles de un libro físico.</w:t>
+                </w:r>
+              </w:p>
+              <w:p>
+                <w:pPr>
+                  <w:spacing w:after="0" w:before="240" w:line="360" w:lineRule="auto"/>
+                  <w:jc w:val="both"/>
+                  <w:rPr>
+                    <w:rFonts w:ascii="Times New Roman" w:cs="Times New Roman" w:eastAsia="Times New Roman" w:hAnsi="Times New Roman"/>
+                    <w:sz w:val="24"/>
+                    <w:szCs w:val="24"/>
+                  </w:rPr>
+                </w:pPr>
+                <w:r>
+                  <w:rPr>
+                    <w:rFonts w:ascii="Times New Roman" w:cs="Times New Roman" w:eastAsia="Times New Roman" w:hAnsi="Times New Roman"/>
+                    <w:b w:val="1"/>
+                    <w:bCs w:val="1"/>
+                    <w:sz w:val="24"/>
+                    <w:szCs w:val="24"/>
+                    <w:rtl w:val="0"/>
+                  </w:rPr>
+                  <w:t xml:space="preserve">Cuando</w:t>
+                </w:r>
+                <w:r>
+                  <w:rPr>
+                    <w:rFonts w:ascii="Times New Roman" w:cs="Times New Roman" w:eastAsia="Times New Roman" w:hAnsi="Times New Roman"/>
+                    <w:sz w:val="24"/>
+                    <w:szCs w:val="24"/>
+                    <w:rtl w:val="0"/>
+                  </w:rPr>
+                  <w:t xml:space="preserve"> el sistema consulta el stock en tiempo real en la base de datos local.</w:t>
+                </w:r>
+              </w:p>
+              <w:p>
+                <w:pPr>
+                  <w:spacing w:after="0" w:before="240" w:line="360" w:lineRule="auto"/>
+                  <w:jc w:val="both"/>
+                  <w:rPr>
+                    <w:rFonts w:ascii="Times New Roman" w:cs="Times New Roman" w:eastAsia="Times New Roman" w:hAnsi="Times New Roman"/>
+                    <w:sz w:val="24"/>
+                    <w:szCs w:val="24"/>
+                  </w:rPr>
+                </w:pPr>
+                <w:r>
+                  <w:rPr>
+                    <w:rFonts w:ascii="Times New Roman" w:cs="Times New Roman" w:eastAsia="Times New Roman" w:hAnsi="Times New Roman"/>
+                    <w:b w:val="1"/>
+                    <w:bCs w:val="1"/>
+                    <w:sz w:val="24"/>
+                    <w:szCs w:val="24"/>
+                    <w:rtl w:val="0"/>
+                  </w:rPr>
+                  <w:t xml:space="preserve">Entonces</w:t>
+                </w:r>
+                <w:r>
+                  <w:rPr>
+                    <w:rFonts w:ascii="Times New Roman" w:cs="Times New Roman" w:eastAsia="Times New Roman" w:hAnsi="Times New Roman"/>
+                    <w:sz w:val="24"/>
+                    <w:szCs w:val="24"/>
+                    <w:rtl w:val="0"/>
+                  </w:rPr>
+                  <w:t xml:space="preserve"> la interfaz muestra la cantidad de ejemplares disponibles o el mensaje "Sin stock actual".</w:t>
+                </w:r>
+              </w:p>
+            </w:tc>
+          </w:tr>
+          <w:tr>
+            <w:trPr>
+              <w:cantSplit w:val="0"/>
               <w:trHeight w:val="1755" w:hRule="atLeast"/>
               <w:tblHeader w:val="0"/>
             </w:trPr>
@@ -11161,6 +11823,40 @@
         <w:spacing w:line="360" w:lineRule="auto"/>
         <w:rPr>
           <w:rFonts w:ascii="Times New Roman" w:cs="Times New Roman" w:eastAsia="Times New Roman" w:hAnsi="Times New Roman"/>
+          <w:b w:val="1"/>
+          <w:bCs w:val="1"/>
+          <w:sz w:val="24"/>
+          <w:szCs w:val="24"/>
+        </w:rPr>
+      </w:pPr>
+      <w:r>
+        <w:rPr>
+          <w:rtl w:val="0"/>
+        </w:rPr>
+      </w:r>
+    </w:p>
+    <w:p>
+      <w:pPr>
+        <w:spacing w:line="360" w:lineRule="auto"/>
+        <w:rPr>
+          <w:rFonts w:ascii="Times New Roman" w:cs="Times New Roman" w:eastAsia="Times New Roman" w:hAnsi="Times New Roman"/>
+          <w:b w:val="1"/>
+          <w:bCs w:val="1"/>
+          <w:sz w:val="24"/>
+          <w:szCs w:val="24"/>
+        </w:rPr>
+      </w:pPr>
+      <w:r>
+        <w:rPr>
+          <w:rtl w:val="0"/>
+        </w:rPr>
+      </w:r>
+    </w:p>
+    <w:p>
+      <w:pPr>
+        <w:spacing w:line="360" w:lineRule="auto"/>
+        <w:rPr>
+          <w:rFonts w:ascii="Times New Roman" w:cs="Times New Roman" w:eastAsia="Times New Roman" w:hAnsi="Times New Roman"/>
           <w:sz w:val="24"/>
           <w:szCs w:val="24"/>
         </w:rPr>
@@ -11185,7 +11881,7 @@
     <w:sdt>
       <w:sdtPr>
         <w:lock w:val="contentLocked"/>
-        <w:id w:val="1115411378"/>
+        <w:id w:val="300722782"/>
         <w:tag w:val="goog_rdk_4"/>
       </w:sdtPr>
       <w:sdtContent>
@@ -11523,6 +12219,251 @@
           <w:tr>
             <w:trPr>
               <w:cantSplit w:val="0"/>
+              <w:trHeight w:val="1005" w:hRule="atLeast"/>
+              <w:tblHeader w:val="0"/>
+            </w:trPr>
+            <w:tc>
+              <w:tcPr>
+                <w:tcBorders>
+                  <w:top w:color="000000" w:space="0" w:sz="0" w:val="nil"/>
+                  <w:left w:color="000000" w:space="0" w:sz="5" w:val="single"/>
+                  <w:bottom w:color="000000" w:space="0" w:sz="5" w:val="single"/>
+                  <w:right w:color="000000" w:space="0" w:sz="5" w:val="single"/>
+                </w:tcBorders>
+                <w:shd w:fill="auto" w:val="clear"/>
+                <w:tcMar>
+                  <w:top w:w="100.0" w:type="dxa"/>
+                  <w:left w:w="100.0" w:type="dxa"/>
+                  <w:bottom w:w="100.0" w:type="dxa"/>
+                  <w:right w:w="100.0" w:type="dxa"/>
+                </w:tcMar>
+                <w:vAlign w:val="top"/>
+              </w:tcPr>
+              <w:p>
+                <w:pPr>
+                  <w:spacing w:after="0" w:before="240" w:line="360" w:lineRule="auto"/>
+                  <w:rPr>
+                    <w:rFonts w:ascii="Times New Roman" w:cs="Times New Roman" w:eastAsia="Times New Roman" w:hAnsi="Times New Roman"/>
+                    <w:b w:val="1"/>
+                    <w:bCs w:val="1"/>
+                    <w:sz w:val="24"/>
+                    <w:szCs w:val="24"/>
+                  </w:rPr>
+                </w:pPr>
+                <w:r>
+                  <w:rPr>
+                    <w:rFonts w:ascii="Times New Roman" w:cs="Times New Roman" w:eastAsia="Times New Roman" w:hAnsi="Times New Roman"/>
+                    <w:b w:val="1"/>
+                    <w:bCs w:val="1"/>
+                    <w:sz w:val="24"/>
+                    <w:szCs w:val="24"/>
+                    <w:rtl w:val="0"/>
+                  </w:rPr>
+                  <w:t xml:space="preserve">Historia de Usuario</w:t>
+                </w:r>
+              </w:p>
+            </w:tc>
+            <w:tc>
+              <w:tcPr>
+                <w:tcBorders>
+                  <w:top w:color="000000" w:space="0" w:sz="0" w:val="nil"/>
+                  <w:left w:color="000000" w:space="0" w:sz="0" w:val="nil"/>
+                  <w:bottom w:color="000000" w:space="0" w:sz="5" w:val="single"/>
+                  <w:right w:color="000000" w:space="0" w:sz="5" w:val="single"/>
+                </w:tcBorders>
+                <w:shd w:fill="auto" w:val="clear"/>
+                <w:tcMar>
+                  <w:top w:w="100.0" w:type="dxa"/>
+                  <w:left w:w="100.0" w:type="dxa"/>
+                  <w:bottom w:w="100.0" w:type="dxa"/>
+                  <w:right w:w="100.0" w:type="dxa"/>
+                </w:tcMar>
+                <w:vAlign w:val="top"/>
+              </w:tcPr>
+              <w:p>
+                <w:pPr>
+                  <w:spacing w:after="0" w:before="240" w:line="360" w:lineRule="auto"/>
+                  <w:jc w:val="both"/>
+                  <w:rPr>
+                    <w:rFonts w:ascii="Times New Roman" w:cs="Times New Roman" w:eastAsia="Times New Roman" w:hAnsi="Times New Roman"/>
+                    <w:sz w:val="24"/>
+                    <w:szCs w:val="24"/>
+                  </w:rPr>
+                </w:pPr>
+                <w:r>
+                  <w:rPr>
+                    <w:rFonts w:ascii="Times New Roman" w:cs="Times New Roman" w:eastAsia="Times New Roman" w:hAnsi="Times New Roman"/>
+                    <w:sz w:val="24"/>
+                    <w:szCs w:val="24"/>
+                    <w:rtl w:val="0"/>
+                  </w:rPr>
+                  <w:t xml:space="preserve">Como usuario, quiero filtrar los resultados por origen o tipo de recurso, para localizar rápidamente materiales que se ajusten a mi necesidad inmediata (física o digital).</w:t>
+                </w:r>
+              </w:p>
+            </w:tc>
+          </w:tr>
+          <w:tr>
+            <w:trPr>
+              <w:cantSplit w:val="0"/>
+              <w:trHeight w:val="1005" w:hRule="atLeast"/>
+              <w:tblHeader w:val="0"/>
+            </w:trPr>
+            <w:tc>
+              <w:tcPr>
+                <w:tcBorders>
+                  <w:top w:color="000000" w:space="0" w:sz="0" w:val="nil"/>
+                  <w:left w:color="000000" w:space="0" w:sz="5" w:val="single"/>
+                  <w:bottom w:color="000000" w:space="0" w:sz="5" w:val="single"/>
+                  <w:right w:color="000000" w:space="0" w:sz="5" w:val="single"/>
+                </w:tcBorders>
+                <w:shd w:fill="auto" w:val="clear"/>
+                <w:tcMar>
+                  <w:top w:w="100.0" w:type="dxa"/>
+                  <w:left w:w="100.0" w:type="dxa"/>
+                  <w:bottom w:w="100.0" w:type="dxa"/>
+                  <w:right w:w="100.0" w:type="dxa"/>
+                </w:tcMar>
+                <w:vAlign w:val="top"/>
+              </w:tcPr>
+              <w:p>
+                <w:pPr>
+                  <w:spacing w:after="0" w:before="240" w:line="360" w:lineRule="auto"/>
+                  <w:rPr>
+                    <w:rFonts w:ascii="Times New Roman" w:cs="Times New Roman" w:eastAsia="Times New Roman" w:hAnsi="Times New Roman"/>
+                    <w:b w:val="1"/>
+                    <w:bCs w:val="1"/>
+                    <w:sz w:val="24"/>
+                    <w:szCs w:val="24"/>
+                  </w:rPr>
+                </w:pPr>
+                <w:r>
+                  <w:rPr>
+                    <w:rFonts w:ascii="Times New Roman" w:cs="Times New Roman" w:eastAsia="Times New Roman" w:hAnsi="Times New Roman"/>
+                    <w:b w:val="1"/>
+                    <w:bCs w:val="1"/>
+                    <w:sz w:val="24"/>
+                    <w:szCs w:val="24"/>
+                    <w:rtl w:val="0"/>
+                  </w:rPr>
+                  <w:t xml:space="preserve">Escenario (Gherkin)</w:t>
+                </w:r>
+              </w:p>
+            </w:tc>
+            <w:tc>
+              <w:tcPr>
+                <w:tcBorders>
+                  <w:top w:color="000000" w:space="0" w:sz="0" w:val="nil"/>
+                  <w:left w:color="000000" w:space="0" w:sz="0" w:val="nil"/>
+                  <w:bottom w:color="000000" w:space="0" w:sz="5" w:val="single"/>
+                  <w:right w:color="000000" w:space="0" w:sz="5" w:val="single"/>
+                </w:tcBorders>
+                <w:shd w:fill="auto" w:val="clear"/>
+                <w:tcMar>
+                  <w:top w:w="100.0" w:type="dxa"/>
+                  <w:left w:w="100.0" w:type="dxa"/>
+                  <w:bottom w:w="100.0" w:type="dxa"/>
+                  <w:right w:w="100.0" w:type="dxa"/>
+                </w:tcMar>
+                <w:vAlign w:val="top"/>
+              </w:tcPr>
+              <w:p>
+                <w:pPr>
+                  <w:spacing w:after="0" w:before="240" w:line="360" w:lineRule="auto"/>
+                  <w:jc w:val="both"/>
+                  <w:rPr>
+                    <w:rFonts w:ascii="Times New Roman" w:cs="Times New Roman" w:eastAsia="Times New Roman" w:hAnsi="Times New Roman"/>
+                    <w:sz w:val="24"/>
+                    <w:szCs w:val="24"/>
+                  </w:rPr>
+                </w:pPr>
+                <w:r>
+                  <w:rPr>
+                    <w:rFonts w:ascii="Times New Roman" w:cs="Times New Roman" w:eastAsia="Times New Roman" w:hAnsi="Times New Roman"/>
+                    <w:b w:val="1"/>
+                    <w:bCs w:val="1"/>
+                    <w:sz w:val="24"/>
+                    <w:szCs w:val="24"/>
+                    <w:rtl w:val="0"/>
+                  </w:rPr>
+                  <w:t xml:space="preserve">Dado</w:t>
+                </w:r>
+                <w:r>
+                  <w:rPr>
+                    <w:rFonts w:ascii="Times New Roman" w:cs="Times New Roman" w:eastAsia="Times New Roman" w:hAnsi="Times New Roman"/>
+                    <w:sz w:val="24"/>
+                    <w:szCs w:val="24"/>
+                    <w:rtl w:val="0"/>
+                  </w:rPr>
+                  <w:t xml:space="preserve"> que el sistema muestra una lista de resultados unificada.</w:t>
+                </w:r>
+              </w:p>
+              <w:p>
+                <w:pPr>
+                  <w:spacing w:after="0" w:before="240" w:line="360" w:lineRule="auto"/>
+                  <w:jc w:val="both"/>
+                  <w:rPr>
+                    <w:rFonts w:ascii="Times New Roman" w:cs="Times New Roman" w:eastAsia="Times New Roman" w:hAnsi="Times New Roman"/>
+                    <w:sz w:val="24"/>
+                    <w:szCs w:val="24"/>
+                  </w:rPr>
+                </w:pPr>
+                <w:r>
+                  <w:rPr>
+                    <w:rFonts w:ascii="Times New Roman" w:cs="Times New Roman" w:eastAsia="Times New Roman" w:hAnsi="Times New Roman"/>
+                    <w:b w:val="1"/>
+                    <w:bCs w:val="1"/>
+                    <w:sz w:val="24"/>
+                    <w:szCs w:val="24"/>
+                    <w:rtl w:val="0"/>
+                  </w:rPr>
+                  <w:t xml:space="preserve">Cuando</w:t>
+                </w:r>
+                <w:r>
+                  <w:rPr>
+                    <w:rFonts w:ascii="Times New Roman" w:cs="Times New Roman" w:eastAsia="Times New Roman" w:hAnsi="Times New Roman"/>
+                    <w:sz w:val="24"/>
+                    <w:szCs w:val="24"/>
+                    <w:rtl w:val="0"/>
+                  </w:rPr>
+                  <w:t xml:space="preserve"> el usuario aplica un filtro (ej: "Solo Físicos") o un criterio de ordenamiento.</w:t>
+                </w:r>
+              </w:p>
+              <w:p>
+                <w:pPr>
+                  <w:spacing w:after="0" w:before="240" w:line="360" w:lineRule="auto"/>
+                  <w:jc w:val="both"/>
+                  <w:rPr>
+                    <w:rFonts w:ascii="Times New Roman" w:cs="Times New Roman" w:eastAsia="Times New Roman" w:hAnsi="Times New Roman"/>
+                    <w:sz w:val="24"/>
+                    <w:szCs w:val="24"/>
+                  </w:rPr>
+                </w:pPr>
+                <w:r>
+                  <w:rPr>
+                    <w:rFonts w:ascii="Times New Roman" w:cs="Times New Roman" w:eastAsia="Times New Roman" w:hAnsi="Times New Roman"/>
+                    <w:b w:val="1"/>
+                    <w:bCs w:val="1"/>
+                    <w:sz w:val="24"/>
+                    <w:szCs w:val="24"/>
+                    <w:rtl w:val="0"/>
+                  </w:rPr>
+                  <w:t xml:space="preserve">Entonces</w:t>
+                </w:r>
+                <w:r>
+                  <w:rPr>
+                    <w:rFonts w:ascii="Times New Roman" w:cs="Times New Roman" w:eastAsia="Times New Roman" w:hAnsi="Times New Roman"/>
+                    <w:sz w:val="24"/>
+                    <w:szCs w:val="24"/>
+                    <w:rtl w:val="0"/>
+                  </w:rPr>
+                  <w:t xml:space="preserve"> la lista se actualiza automáticamente mostrando solo los elementos que cumplen con los parámetros seleccionados.</w:t>
+                </w:r>
+              </w:p>
+            </w:tc>
+          </w:tr>
+          <w:tr>
+            <w:trPr>
+              <w:cantSplit w:val="0"/>
               <w:trHeight w:val="1755" w:hRule="atLeast"/>
               <w:tblHeader w:val="0"/>
             </w:trPr>
@@ -12023,81 +12964,6 @@
       </w:pPr>
       <w:r>
         <w:rPr>
-          <w:rtl w:val="0"/>
-        </w:rPr>
-      </w:r>
-    </w:p>
-    <w:p>
-      <w:pPr>
-        <w:spacing w:line="360" w:lineRule="auto"/>
-        <w:rPr>
-          <w:rFonts w:ascii="Times New Roman" w:cs="Times New Roman" w:eastAsia="Times New Roman" w:hAnsi="Times New Roman"/>
-          <w:sz w:val="24"/>
-          <w:szCs w:val="24"/>
-        </w:rPr>
-      </w:pPr>
-      <w:r>
-        <w:rPr>
-          <w:rtl w:val="0"/>
-        </w:rPr>
-      </w:r>
-    </w:p>
-    <w:p>
-      <w:pPr>
-        <w:spacing w:line="360" w:lineRule="auto"/>
-        <w:rPr>
-          <w:rFonts w:ascii="Times New Roman" w:cs="Times New Roman" w:eastAsia="Times New Roman" w:hAnsi="Times New Roman"/>
-          <w:sz w:val="24"/>
-          <w:szCs w:val="24"/>
-        </w:rPr>
-      </w:pPr>
-      <w:r>
-        <w:rPr>
-          <w:rtl w:val="0"/>
-        </w:rPr>
-      </w:r>
-    </w:p>
-    <w:p>
-      <w:pPr>
-        <w:spacing w:line="360" w:lineRule="auto"/>
-        <w:rPr>
-          <w:rFonts w:ascii="Times New Roman" w:cs="Times New Roman" w:eastAsia="Times New Roman" w:hAnsi="Times New Roman"/>
-          <w:sz w:val="24"/>
-          <w:szCs w:val="24"/>
-        </w:rPr>
-      </w:pPr>
-      <w:r>
-        <w:rPr>
-          <w:rtl w:val="0"/>
-        </w:rPr>
-      </w:r>
-    </w:p>
-    <w:p>
-      <w:pPr>
-        <w:spacing w:line="360" w:lineRule="auto"/>
-        <w:rPr>
-          <w:rFonts w:ascii="Times New Roman" w:cs="Times New Roman" w:eastAsia="Times New Roman" w:hAnsi="Times New Roman"/>
-          <w:sz w:val="24"/>
-          <w:szCs w:val="24"/>
-        </w:rPr>
-      </w:pPr>
-      <w:r>
-        <w:rPr>
-          <w:rtl w:val="0"/>
-        </w:rPr>
-      </w:r>
-    </w:p>
-    <w:p>
-      <w:pPr>
-        <w:spacing w:line="360" w:lineRule="auto"/>
-        <w:rPr>
-          <w:rFonts w:ascii="Times New Roman" w:cs="Times New Roman" w:eastAsia="Times New Roman" w:hAnsi="Times New Roman"/>
-          <w:sz w:val="24"/>
-          <w:szCs w:val="24"/>
-        </w:rPr>
-      </w:pPr>
-      <w:r>
-        <w:rPr>
           <w:rFonts w:ascii="Times New Roman" w:cs="Times New Roman" w:eastAsia="Times New Roman" w:hAnsi="Times New Roman"/>
           <w:b w:val="1"/>
           <w:bCs w:val="1"/>
@@ -12116,7 +12982,7 @@
     <w:sdt>
       <w:sdtPr>
         <w:lock w:val="contentLocked"/>
-        <w:id w:val="2079326821"/>
+        <w:id w:val="-1581518778"/>
         <w:tag w:val="goog_rdk_5"/>
       </w:sdtPr>
       <w:sdtContent>
@@ -12454,6 +13320,251 @@
           <w:tr>
             <w:trPr>
               <w:cantSplit w:val="0"/>
+              <w:trHeight w:val="1005" w:hRule="atLeast"/>
+              <w:tblHeader w:val="0"/>
+            </w:trPr>
+            <w:tc>
+              <w:tcPr>
+                <w:tcBorders>
+                  <w:top w:color="000000" w:space="0" w:sz="0" w:val="nil"/>
+                  <w:left w:color="000000" w:space="0" w:sz="5" w:val="single"/>
+                  <w:bottom w:color="000000" w:space="0" w:sz="5" w:val="single"/>
+                  <w:right w:color="000000" w:space="0" w:sz="5" w:val="single"/>
+                </w:tcBorders>
+                <w:shd w:fill="auto" w:val="clear"/>
+                <w:tcMar>
+                  <w:top w:w="100.0" w:type="dxa"/>
+                  <w:left w:w="100.0" w:type="dxa"/>
+                  <w:bottom w:w="100.0" w:type="dxa"/>
+                  <w:right w:w="100.0" w:type="dxa"/>
+                </w:tcMar>
+                <w:vAlign w:val="top"/>
+              </w:tcPr>
+              <w:p>
+                <w:pPr>
+                  <w:spacing w:after="0" w:before="240" w:line="360" w:lineRule="auto"/>
+                  <w:rPr>
+                    <w:rFonts w:ascii="Times New Roman" w:cs="Times New Roman" w:eastAsia="Times New Roman" w:hAnsi="Times New Roman"/>
+                    <w:b w:val="1"/>
+                    <w:bCs w:val="1"/>
+                    <w:sz w:val="24"/>
+                    <w:szCs w:val="24"/>
+                  </w:rPr>
+                </w:pPr>
+                <w:r>
+                  <w:rPr>
+                    <w:rFonts w:ascii="Times New Roman" w:cs="Times New Roman" w:eastAsia="Times New Roman" w:hAnsi="Times New Roman"/>
+                    <w:b w:val="1"/>
+                    <w:bCs w:val="1"/>
+                    <w:sz w:val="24"/>
+                    <w:szCs w:val="24"/>
+                    <w:rtl w:val="0"/>
+                  </w:rPr>
+                  <w:t xml:space="preserve">Historia de Usuario</w:t>
+                </w:r>
+              </w:p>
+            </w:tc>
+            <w:tc>
+              <w:tcPr>
+                <w:tcBorders>
+                  <w:top w:color="000000" w:space="0" w:sz="0" w:val="nil"/>
+                  <w:left w:color="000000" w:space="0" w:sz="0" w:val="nil"/>
+                  <w:bottom w:color="000000" w:space="0" w:sz="5" w:val="single"/>
+                  <w:right w:color="000000" w:space="0" w:sz="5" w:val="single"/>
+                </w:tcBorders>
+                <w:shd w:fill="auto" w:val="clear"/>
+                <w:tcMar>
+                  <w:top w:w="100.0" w:type="dxa"/>
+                  <w:left w:w="100.0" w:type="dxa"/>
+                  <w:bottom w:w="100.0" w:type="dxa"/>
+                  <w:right w:w="100.0" w:type="dxa"/>
+                </w:tcMar>
+                <w:vAlign w:val="top"/>
+              </w:tcPr>
+              <w:p>
+                <w:pPr>
+                  <w:spacing w:after="0" w:before="240" w:line="360" w:lineRule="auto"/>
+                  <w:jc w:val="both"/>
+                  <w:rPr>
+                    <w:rFonts w:ascii="Times New Roman" w:cs="Times New Roman" w:eastAsia="Times New Roman" w:hAnsi="Times New Roman"/>
+                    <w:sz w:val="24"/>
+                    <w:szCs w:val="24"/>
+                  </w:rPr>
+                </w:pPr>
+                <w:r>
+                  <w:rPr>
+                    <w:rFonts w:ascii="Times New Roman" w:cs="Times New Roman" w:eastAsia="Times New Roman" w:hAnsi="Times New Roman"/>
+                    <w:sz w:val="24"/>
+                    <w:szCs w:val="24"/>
+                    <w:rtl w:val="0"/>
+                  </w:rPr>
+                  <w:t xml:space="preserve">Como lector, quiero conocer el piso y estante exacto de un libro, para encontrarlo físicamente en la biblioteca sin necesidad de consultar al personal.</w:t>
+                </w:r>
+              </w:p>
+            </w:tc>
+          </w:tr>
+          <w:tr>
+            <w:trPr>
+              <w:cantSplit w:val="0"/>
+              <w:trHeight w:val="1005" w:hRule="atLeast"/>
+              <w:tblHeader w:val="0"/>
+            </w:trPr>
+            <w:tc>
+              <w:tcPr>
+                <w:tcBorders>
+                  <w:top w:color="000000" w:space="0" w:sz="0" w:val="nil"/>
+                  <w:left w:color="000000" w:space="0" w:sz="5" w:val="single"/>
+                  <w:bottom w:color="000000" w:space="0" w:sz="5" w:val="single"/>
+                  <w:right w:color="000000" w:space="0" w:sz="5" w:val="single"/>
+                </w:tcBorders>
+                <w:shd w:fill="auto" w:val="clear"/>
+                <w:tcMar>
+                  <w:top w:w="100.0" w:type="dxa"/>
+                  <w:left w:w="100.0" w:type="dxa"/>
+                  <w:bottom w:w="100.0" w:type="dxa"/>
+                  <w:right w:w="100.0" w:type="dxa"/>
+                </w:tcMar>
+                <w:vAlign w:val="top"/>
+              </w:tcPr>
+              <w:p>
+                <w:pPr>
+                  <w:spacing w:after="0" w:before="240" w:line="360" w:lineRule="auto"/>
+                  <w:rPr>
+                    <w:rFonts w:ascii="Times New Roman" w:cs="Times New Roman" w:eastAsia="Times New Roman" w:hAnsi="Times New Roman"/>
+                    <w:b w:val="1"/>
+                    <w:bCs w:val="1"/>
+                    <w:sz w:val="24"/>
+                    <w:szCs w:val="24"/>
+                  </w:rPr>
+                </w:pPr>
+                <w:r>
+                  <w:rPr>
+                    <w:rFonts w:ascii="Times New Roman" w:cs="Times New Roman" w:eastAsia="Times New Roman" w:hAnsi="Times New Roman"/>
+                    <w:b w:val="1"/>
+                    <w:bCs w:val="1"/>
+                    <w:sz w:val="24"/>
+                    <w:szCs w:val="24"/>
+                    <w:rtl w:val="0"/>
+                  </w:rPr>
+                  <w:t xml:space="preserve">Escenario (Gherkin)</w:t>
+                </w:r>
+              </w:p>
+            </w:tc>
+            <w:tc>
+              <w:tcPr>
+                <w:tcBorders>
+                  <w:top w:color="000000" w:space="0" w:sz="0" w:val="nil"/>
+                  <w:left w:color="000000" w:space="0" w:sz="0" w:val="nil"/>
+                  <w:bottom w:color="000000" w:space="0" w:sz="5" w:val="single"/>
+                  <w:right w:color="000000" w:space="0" w:sz="5" w:val="single"/>
+                </w:tcBorders>
+                <w:shd w:fill="auto" w:val="clear"/>
+                <w:tcMar>
+                  <w:top w:w="100.0" w:type="dxa"/>
+                  <w:left w:w="100.0" w:type="dxa"/>
+                  <w:bottom w:w="100.0" w:type="dxa"/>
+                  <w:right w:w="100.0" w:type="dxa"/>
+                </w:tcMar>
+                <w:vAlign w:val="top"/>
+              </w:tcPr>
+              <w:p>
+                <w:pPr>
+                  <w:spacing w:after="0" w:before="240" w:line="360" w:lineRule="auto"/>
+                  <w:jc w:val="both"/>
+                  <w:rPr>
+                    <w:rFonts w:ascii="Times New Roman" w:cs="Times New Roman" w:eastAsia="Times New Roman" w:hAnsi="Times New Roman"/>
+                    <w:sz w:val="24"/>
+                    <w:szCs w:val="24"/>
+                  </w:rPr>
+                </w:pPr>
+                <w:r>
+                  <w:rPr>
+                    <w:rFonts w:ascii="Times New Roman" w:cs="Times New Roman" w:eastAsia="Times New Roman" w:hAnsi="Times New Roman"/>
+                    <w:b w:val="1"/>
+                    <w:bCs w:val="1"/>
+                    <w:sz w:val="24"/>
+                    <w:szCs w:val="24"/>
+                    <w:rtl w:val="0"/>
+                  </w:rPr>
+                  <w:t xml:space="preserve">Dado</w:t>
+                </w:r>
+                <w:r>
+                  <w:rPr>
+                    <w:rFonts w:ascii="Times New Roman" w:cs="Times New Roman" w:eastAsia="Times New Roman" w:hAnsi="Times New Roman"/>
+                    <w:sz w:val="24"/>
+                    <w:szCs w:val="24"/>
+                    <w:rtl w:val="0"/>
+                  </w:rPr>
+                  <w:t xml:space="preserve"> que el usuario se encuentra en la vista de detalles de un libro disponible en sala.</w:t>
+                </w:r>
+              </w:p>
+              <w:p>
+                <w:pPr>
+                  <w:spacing w:after="0" w:before="240" w:line="360" w:lineRule="auto"/>
+                  <w:jc w:val="both"/>
+                  <w:rPr>
+                    <w:rFonts w:ascii="Times New Roman" w:cs="Times New Roman" w:eastAsia="Times New Roman" w:hAnsi="Times New Roman"/>
+                    <w:sz w:val="24"/>
+                    <w:szCs w:val="24"/>
+                  </w:rPr>
+                </w:pPr>
+                <w:r>
+                  <w:rPr>
+                    <w:rFonts w:ascii="Times New Roman" w:cs="Times New Roman" w:eastAsia="Times New Roman" w:hAnsi="Times New Roman"/>
+                    <w:b w:val="1"/>
+                    <w:bCs w:val="1"/>
+                    <w:sz w:val="24"/>
+                    <w:szCs w:val="24"/>
+                    <w:rtl w:val="0"/>
+                  </w:rPr>
+                  <w:t xml:space="preserve">Cuando</w:t>
+                </w:r>
+                <w:r>
+                  <w:rPr>
+                    <w:rFonts w:ascii="Times New Roman" w:cs="Times New Roman" w:eastAsia="Times New Roman" w:hAnsi="Times New Roman"/>
+                    <w:sz w:val="24"/>
+                    <w:szCs w:val="24"/>
+                    <w:rtl w:val="0"/>
+                  </w:rPr>
+                  <w:t xml:space="preserve"> accede al panel de localización física.</w:t>
+                </w:r>
+              </w:p>
+              <w:p>
+                <w:pPr>
+                  <w:spacing w:after="0" w:before="240" w:line="360" w:lineRule="auto"/>
+                  <w:jc w:val="both"/>
+                  <w:rPr>
+                    <w:rFonts w:ascii="Times New Roman" w:cs="Times New Roman" w:eastAsia="Times New Roman" w:hAnsi="Times New Roman"/>
+                    <w:sz w:val="24"/>
+                    <w:szCs w:val="24"/>
+                  </w:rPr>
+                </w:pPr>
+                <w:r>
+                  <w:rPr>
+                    <w:rFonts w:ascii="Times New Roman" w:cs="Times New Roman" w:eastAsia="Times New Roman" w:hAnsi="Times New Roman"/>
+                    <w:b w:val="1"/>
+                    <w:bCs w:val="1"/>
+                    <w:sz w:val="24"/>
+                    <w:szCs w:val="24"/>
+                    <w:rtl w:val="0"/>
+                  </w:rPr>
+                  <w:t xml:space="preserve">Entonces</w:t>
+                </w:r>
+                <w:r>
+                  <w:rPr>
+                    <w:rFonts w:ascii="Times New Roman" w:cs="Times New Roman" w:eastAsia="Times New Roman" w:hAnsi="Times New Roman"/>
+                    <w:sz w:val="24"/>
+                    <w:szCs w:val="24"/>
+                    <w:rtl w:val="0"/>
+                  </w:rPr>
+                  <w:t xml:space="preserve"> el sistema presenta el número de piso, el código del estante y una instrucción de guía textual.</w:t>
+                </w:r>
+              </w:p>
+            </w:tc>
+          </w:tr>
+          <w:tr>
+            <w:trPr>
+              <w:cantSplit w:val="0"/>
               <w:trHeight w:val="1755" w:hRule="atLeast"/>
               <w:tblHeader w:val="0"/>
             </w:trPr>
@@ -12929,6 +14040,23 @@
         <w:spacing w:line="360" w:lineRule="auto"/>
         <w:rPr>
           <w:rFonts w:ascii="Times New Roman" w:cs="Times New Roman" w:eastAsia="Times New Roman" w:hAnsi="Times New Roman"/>
+          <w:b w:val="1"/>
+          <w:bCs w:val="1"/>
+          <w:sz w:val="24"/>
+          <w:szCs w:val="24"/>
+        </w:rPr>
+      </w:pPr>
+      <w:r>
+        <w:rPr>
+          <w:rtl w:val="0"/>
+        </w:rPr>
+      </w:r>
+    </w:p>
+    <w:p>
+      <w:pPr>
+        <w:spacing w:line="360" w:lineRule="auto"/>
+        <w:rPr>
+          <w:rFonts w:ascii="Times New Roman" w:cs="Times New Roman" w:eastAsia="Times New Roman" w:hAnsi="Times New Roman"/>
           <w:sz w:val="24"/>
           <w:szCs w:val="24"/>
         </w:rPr>
@@ -12953,7 +14081,7 @@
     <w:sdt>
       <w:sdtPr>
         <w:lock w:val="contentLocked"/>
-        <w:id w:val="-1845562625"/>
+        <w:id w:val="-182988517"/>
         <w:tag w:val="goog_rdk_6"/>
       </w:sdtPr>
       <w:sdtContent>
@@ -13291,6 +14419,251 @@
           <w:tr>
             <w:trPr>
               <w:cantSplit w:val="0"/>
+              <w:trHeight w:val="1005" w:hRule="atLeast"/>
+              <w:tblHeader w:val="0"/>
+            </w:trPr>
+            <w:tc>
+              <w:tcPr>
+                <w:tcBorders>
+                  <w:top w:color="000000" w:space="0" w:sz="0" w:val="nil"/>
+                  <w:left w:color="000000" w:space="0" w:sz="5" w:val="single"/>
+                  <w:bottom w:color="000000" w:space="0" w:sz="5" w:val="single"/>
+                  <w:right w:color="000000" w:space="0" w:sz="5" w:val="single"/>
+                </w:tcBorders>
+                <w:shd w:fill="auto" w:val="clear"/>
+                <w:tcMar>
+                  <w:top w:w="100.0" w:type="dxa"/>
+                  <w:left w:w="100.0" w:type="dxa"/>
+                  <w:bottom w:w="100.0" w:type="dxa"/>
+                  <w:right w:w="100.0" w:type="dxa"/>
+                </w:tcMar>
+                <w:vAlign w:val="top"/>
+              </w:tcPr>
+              <w:p>
+                <w:pPr>
+                  <w:spacing w:after="0" w:before="240" w:line="360" w:lineRule="auto"/>
+                  <w:rPr>
+                    <w:rFonts w:ascii="Times New Roman" w:cs="Times New Roman" w:eastAsia="Times New Roman" w:hAnsi="Times New Roman"/>
+                    <w:b w:val="1"/>
+                    <w:bCs w:val="1"/>
+                    <w:sz w:val="24"/>
+                    <w:szCs w:val="24"/>
+                  </w:rPr>
+                </w:pPr>
+                <w:r>
+                  <w:rPr>
+                    <w:rFonts w:ascii="Times New Roman" w:cs="Times New Roman" w:eastAsia="Times New Roman" w:hAnsi="Times New Roman"/>
+                    <w:b w:val="1"/>
+                    <w:bCs w:val="1"/>
+                    <w:sz w:val="24"/>
+                    <w:szCs w:val="24"/>
+                    <w:rtl w:val="0"/>
+                  </w:rPr>
+                  <w:t xml:space="preserve">Historia de Usuario</w:t>
+                </w:r>
+              </w:p>
+            </w:tc>
+            <w:tc>
+              <w:tcPr>
+                <w:tcBorders>
+                  <w:top w:color="000000" w:space="0" w:sz="0" w:val="nil"/>
+                  <w:left w:color="000000" w:space="0" w:sz="0" w:val="nil"/>
+                  <w:bottom w:color="000000" w:space="0" w:sz="5" w:val="single"/>
+                  <w:right w:color="000000" w:space="0" w:sz="5" w:val="single"/>
+                </w:tcBorders>
+                <w:shd w:fill="auto" w:val="clear"/>
+                <w:tcMar>
+                  <w:top w:w="100.0" w:type="dxa"/>
+                  <w:left w:w="100.0" w:type="dxa"/>
+                  <w:bottom w:w="100.0" w:type="dxa"/>
+                  <w:right w:w="100.0" w:type="dxa"/>
+                </w:tcMar>
+                <w:vAlign w:val="top"/>
+              </w:tcPr>
+              <w:p>
+                <w:pPr>
+                  <w:spacing w:after="0" w:before="240" w:line="360" w:lineRule="auto"/>
+                  <w:jc w:val="both"/>
+                  <w:rPr>
+                    <w:rFonts w:ascii="Times New Roman" w:cs="Times New Roman" w:eastAsia="Times New Roman" w:hAnsi="Times New Roman"/>
+                    <w:sz w:val="24"/>
+                    <w:szCs w:val="24"/>
+                  </w:rPr>
+                </w:pPr>
+                <w:r>
+                  <w:rPr>
+                    <w:rFonts w:ascii="Times New Roman" w:cs="Times New Roman" w:eastAsia="Times New Roman" w:hAnsi="Times New Roman"/>
+                    <w:sz w:val="24"/>
+                    <w:szCs w:val="24"/>
+                    <w:rtl w:val="0"/>
+                  </w:rPr>
+                  <w:t xml:space="preserve">Como usuario remoto, quiero acceder a enlaces de visualización digital, para consultar la información del recurso de manera inmediata desde cualquier ubicación.</w:t>
+                </w:r>
+              </w:p>
+            </w:tc>
+          </w:tr>
+          <w:tr>
+            <w:trPr>
+              <w:cantSplit w:val="0"/>
+              <w:trHeight w:val="1005" w:hRule="atLeast"/>
+              <w:tblHeader w:val="0"/>
+            </w:trPr>
+            <w:tc>
+              <w:tcPr>
+                <w:tcBorders>
+                  <w:top w:color="000000" w:space="0" w:sz="0" w:val="nil"/>
+                  <w:left w:color="000000" w:space="0" w:sz="5" w:val="single"/>
+                  <w:bottom w:color="000000" w:space="0" w:sz="5" w:val="single"/>
+                  <w:right w:color="000000" w:space="0" w:sz="5" w:val="single"/>
+                </w:tcBorders>
+                <w:shd w:fill="auto" w:val="clear"/>
+                <w:tcMar>
+                  <w:top w:w="100.0" w:type="dxa"/>
+                  <w:left w:w="100.0" w:type="dxa"/>
+                  <w:bottom w:w="100.0" w:type="dxa"/>
+                  <w:right w:w="100.0" w:type="dxa"/>
+                </w:tcMar>
+                <w:vAlign w:val="top"/>
+              </w:tcPr>
+              <w:p>
+                <w:pPr>
+                  <w:spacing w:after="0" w:before="240" w:line="360" w:lineRule="auto"/>
+                  <w:rPr>
+                    <w:rFonts w:ascii="Times New Roman" w:cs="Times New Roman" w:eastAsia="Times New Roman" w:hAnsi="Times New Roman"/>
+                    <w:b w:val="1"/>
+                    <w:bCs w:val="1"/>
+                    <w:sz w:val="24"/>
+                    <w:szCs w:val="24"/>
+                  </w:rPr>
+                </w:pPr>
+                <w:r>
+                  <w:rPr>
+                    <w:rFonts w:ascii="Times New Roman" w:cs="Times New Roman" w:eastAsia="Times New Roman" w:hAnsi="Times New Roman"/>
+                    <w:b w:val="1"/>
+                    <w:bCs w:val="1"/>
+                    <w:sz w:val="24"/>
+                    <w:szCs w:val="24"/>
+                    <w:rtl w:val="0"/>
+                  </w:rPr>
+                  <w:t xml:space="preserve">Escenario (Gherkin)</w:t>
+                </w:r>
+              </w:p>
+            </w:tc>
+            <w:tc>
+              <w:tcPr>
+                <w:tcBorders>
+                  <w:top w:color="000000" w:space="0" w:sz="0" w:val="nil"/>
+                  <w:left w:color="000000" w:space="0" w:sz="0" w:val="nil"/>
+                  <w:bottom w:color="000000" w:space="0" w:sz="5" w:val="single"/>
+                  <w:right w:color="000000" w:space="0" w:sz="5" w:val="single"/>
+                </w:tcBorders>
+                <w:shd w:fill="auto" w:val="clear"/>
+                <w:tcMar>
+                  <w:top w:w="100.0" w:type="dxa"/>
+                  <w:left w:w="100.0" w:type="dxa"/>
+                  <w:bottom w:w="100.0" w:type="dxa"/>
+                  <w:right w:w="100.0" w:type="dxa"/>
+                </w:tcMar>
+                <w:vAlign w:val="top"/>
+              </w:tcPr>
+              <w:p>
+                <w:pPr>
+                  <w:spacing w:after="0" w:before="240" w:line="360" w:lineRule="auto"/>
+                  <w:jc w:val="both"/>
+                  <w:rPr>
+                    <w:rFonts w:ascii="Times New Roman" w:cs="Times New Roman" w:eastAsia="Times New Roman" w:hAnsi="Times New Roman"/>
+                    <w:sz w:val="24"/>
+                    <w:szCs w:val="24"/>
+                  </w:rPr>
+                </w:pPr>
+                <w:r>
+                  <w:rPr>
+                    <w:rFonts w:ascii="Times New Roman" w:cs="Times New Roman" w:eastAsia="Times New Roman" w:hAnsi="Times New Roman"/>
+                    <w:b w:val="1"/>
+                    <w:bCs w:val="1"/>
+                    <w:sz w:val="24"/>
+                    <w:szCs w:val="24"/>
+                    <w:rtl w:val="0"/>
+                  </w:rPr>
+                  <w:t xml:space="preserve">Dado</w:t>
+                </w:r>
+                <w:r>
+                  <w:rPr>
+                    <w:rFonts w:ascii="Times New Roman" w:cs="Times New Roman" w:eastAsia="Times New Roman" w:hAnsi="Times New Roman"/>
+                    <w:sz w:val="24"/>
+                    <w:szCs w:val="24"/>
+                    <w:rtl w:val="0"/>
+                  </w:rPr>
+                  <w:t xml:space="preserve"> que el libro seleccionado cuenta con una versión electrónica disponible.</w:t>
+                </w:r>
+              </w:p>
+              <w:p>
+                <w:pPr>
+                  <w:spacing w:after="0" w:before="240" w:line="360" w:lineRule="auto"/>
+                  <w:jc w:val="both"/>
+                  <w:rPr>
+                    <w:rFonts w:ascii="Times New Roman" w:cs="Times New Roman" w:eastAsia="Times New Roman" w:hAnsi="Times New Roman"/>
+                    <w:sz w:val="24"/>
+                    <w:szCs w:val="24"/>
+                  </w:rPr>
+                </w:pPr>
+                <w:r>
+                  <w:rPr>
+                    <w:rFonts w:ascii="Times New Roman" w:cs="Times New Roman" w:eastAsia="Times New Roman" w:hAnsi="Times New Roman"/>
+                    <w:b w:val="1"/>
+                    <w:bCs w:val="1"/>
+                    <w:sz w:val="24"/>
+                    <w:szCs w:val="24"/>
+                    <w:rtl w:val="0"/>
+                  </w:rPr>
+                  <w:t xml:space="preserve">Cuando</w:t>
+                </w:r>
+                <w:r>
+                  <w:rPr>
+                    <w:rFonts w:ascii="Times New Roman" w:cs="Times New Roman" w:eastAsia="Times New Roman" w:hAnsi="Times New Roman"/>
+                    <w:sz w:val="24"/>
+                    <w:szCs w:val="24"/>
+                    <w:rtl w:val="0"/>
+                  </w:rPr>
+                  <w:t xml:space="preserve"> el usuario presiona el botón "Recurso Digital".</w:t>
+                </w:r>
+              </w:p>
+              <w:p>
+                <w:pPr>
+                  <w:spacing w:after="0" w:before="240" w:line="360" w:lineRule="auto"/>
+                  <w:jc w:val="both"/>
+                  <w:rPr>
+                    <w:rFonts w:ascii="Times New Roman" w:cs="Times New Roman" w:eastAsia="Times New Roman" w:hAnsi="Times New Roman"/>
+                    <w:sz w:val="24"/>
+                    <w:szCs w:val="24"/>
+                  </w:rPr>
+                </w:pPr>
+                <w:r>
+                  <w:rPr>
+                    <w:rFonts w:ascii="Times New Roman" w:cs="Times New Roman" w:eastAsia="Times New Roman" w:hAnsi="Times New Roman"/>
+                    <w:b w:val="1"/>
+                    <w:bCs w:val="1"/>
+                    <w:sz w:val="24"/>
+                    <w:szCs w:val="24"/>
+                    <w:rtl w:val="0"/>
+                  </w:rPr>
+                  <w:t xml:space="preserve">Entonces</w:t>
+                </w:r>
+                <w:r>
+                  <w:rPr>
+                    <w:rFonts w:ascii="Times New Roman" w:cs="Times New Roman" w:eastAsia="Times New Roman" w:hAnsi="Times New Roman"/>
+                    <w:sz w:val="24"/>
+                    <w:szCs w:val="24"/>
+                    <w:rtl w:val="0"/>
+                  </w:rPr>
+                  <w:t xml:space="preserve"> el sistema abre automáticamente una nueva pestaña con el visor del material o el enlace al repositorio institucional.</w:t>
+                </w:r>
+              </w:p>
+            </w:tc>
+          </w:tr>
+          <w:tr>
+            <w:trPr>
+              <w:cantSplit w:val="0"/>
               <w:trHeight w:val="1755" w:hRule="atLeast"/>
               <w:tblHeader w:val="0"/>
             </w:trPr>
@@ -14693,126 +16066,6 @@
     </w:p>
     <w:p>
       <w:pPr>
-        <w:spacing w:line="360" w:lineRule="auto"/>
-        <w:rPr>
-          <w:rFonts w:ascii="Times New Roman" w:cs="Times New Roman" w:eastAsia="Times New Roman" w:hAnsi="Times New Roman"/>
-          <w:sz w:val="24"/>
-          <w:szCs w:val="24"/>
-        </w:rPr>
-      </w:pPr>
-      <w:r>
-        <w:rPr>
-          <w:rtl w:val="0"/>
-        </w:rPr>
-      </w:r>
-    </w:p>
-    <w:p>
-      <w:pPr>
-        <w:spacing w:line="360" w:lineRule="auto"/>
-        <w:rPr>
-          <w:rFonts w:ascii="Times New Roman" w:cs="Times New Roman" w:eastAsia="Times New Roman" w:hAnsi="Times New Roman"/>
-          <w:sz w:val="24"/>
-          <w:szCs w:val="24"/>
-        </w:rPr>
-      </w:pPr>
-      <w:r>
-        <w:rPr>
-          <w:rtl w:val="0"/>
-        </w:rPr>
-      </w:r>
-    </w:p>
-    <w:p>
-      <w:pPr>
-        <w:spacing w:line="360" w:lineRule="auto"/>
-        <w:rPr>
-          <w:rFonts w:ascii="Times New Roman" w:cs="Times New Roman" w:eastAsia="Times New Roman" w:hAnsi="Times New Roman"/>
-          <w:sz w:val="24"/>
-          <w:szCs w:val="24"/>
-        </w:rPr>
-      </w:pPr>
-      <w:r>
-        <w:rPr>
-          <w:rtl w:val="0"/>
-        </w:rPr>
-      </w:r>
-    </w:p>
-    <w:p>
-      <w:pPr>
-        <w:spacing w:line="360" w:lineRule="auto"/>
-        <w:rPr>
-          <w:rFonts w:ascii="Times New Roman" w:cs="Times New Roman" w:eastAsia="Times New Roman" w:hAnsi="Times New Roman"/>
-          <w:sz w:val="24"/>
-          <w:szCs w:val="24"/>
-        </w:rPr>
-      </w:pPr>
-      <w:r>
-        <w:rPr>
-          <w:rtl w:val="0"/>
-        </w:rPr>
-      </w:r>
-    </w:p>
-    <w:p>
-      <w:pPr>
-        <w:spacing w:line="360" w:lineRule="auto"/>
-        <w:rPr>
-          <w:rFonts w:ascii="Times New Roman" w:cs="Times New Roman" w:eastAsia="Times New Roman" w:hAnsi="Times New Roman"/>
-          <w:sz w:val="24"/>
-          <w:szCs w:val="24"/>
-        </w:rPr>
-      </w:pPr>
-      <w:r>
-        <w:rPr>
-          <w:rtl w:val="0"/>
-        </w:rPr>
-      </w:r>
-    </w:p>
-    <w:p>
-      <w:pPr>
-        <w:spacing w:line="360" w:lineRule="auto"/>
-        <w:rPr>
-          <w:rFonts w:ascii="Times New Roman" w:cs="Times New Roman" w:eastAsia="Times New Roman" w:hAnsi="Times New Roman"/>
-          <w:sz w:val="24"/>
-          <w:szCs w:val="24"/>
-        </w:rPr>
-      </w:pPr>
-      <w:r>
-        <w:rPr>
-          <w:rtl w:val="0"/>
-        </w:rPr>
-      </w:r>
-    </w:p>
-    <w:p>
-      <w:pPr>
-        <w:spacing w:line="360" w:lineRule="auto"/>
-        <w:rPr>
-          <w:rFonts w:ascii="Times New Roman" w:cs="Times New Roman" w:eastAsia="Times New Roman" w:hAnsi="Times New Roman"/>
-          <w:sz w:val="24"/>
-          <w:szCs w:val="24"/>
-        </w:rPr>
-      </w:pPr>
-      <w:r>
-        <w:rPr>
-          <w:rtl w:val="0"/>
-        </w:rPr>
-      </w:r>
-    </w:p>
-    <w:p>
-      <w:pPr>
-        <w:spacing w:line="360" w:lineRule="auto"/>
-        <w:rPr>
-          <w:rFonts w:ascii="Times New Roman" w:cs="Times New Roman" w:eastAsia="Times New Roman" w:hAnsi="Times New Roman"/>
-          <w:sz w:val="24"/>
-          <w:szCs w:val="24"/>
-        </w:rPr>
-      </w:pPr>
-      <w:r>
-        <w:rPr>
-          <w:rtl w:val="0"/>
-        </w:rPr>
-      </w:r>
-    </w:p>
-    <w:p>
-      <w:pPr>
         <w:pStyle w:val="Heading3"/>
         <w:spacing w:line="360" w:lineRule="auto"/>
         <w:rPr>
@@ -14886,12 +16139,12 @@
           <wp:inline distB="114300" distT="114300" distL="114300" distR="114300">
             <wp:extent cx="4762500" cy="5724525"/>
             <wp:effectExtent b="25400" l="25400" r="25400" t="25400"/>
-            <wp:docPr id="4" name="image8.png"/>
+            <wp:docPr id="4" name="image2.png"/>
             <a:graphic>
               <a:graphicData uri="http://schemas.openxmlformats.org/drawingml/2006/picture">
                 <pic:pic>
                   <pic:nvPicPr>
-                    <pic:cNvPr id="0" name="image8.png"/>
+                    <pic:cNvPr id="0" name="image2.png"/>
                     <pic:cNvPicPr preferRelativeResize="0"/>
                   </pic:nvPicPr>
                   <pic:blipFill>
@@ -15125,12 +16378,12 @@
           <wp:inline distB="114300" distT="114300" distL="114300" distR="114300">
             <wp:extent cx="5399730" cy="4953000"/>
             <wp:effectExtent b="25400" l="25400" r="25400" t="25400"/>
-            <wp:docPr id="9" name="image15.png"/>
+            <wp:docPr id="9" name="image9.png"/>
             <a:graphic>
               <a:graphicData uri="http://schemas.openxmlformats.org/drawingml/2006/picture">
                 <pic:pic>
                   <pic:nvPicPr>
-                    <pic:cNvPr id="0" name="image15.png"/>
+                    <pic:cNvPr id="0" name="image9.png"/>
                     <pic:cNvPicPr preferRelativeResize="0"/>
                   </pic:nvPicPr>
                   <pic:blipFill>
@@ -15313,12 +16566,12 @@
           <wp:inline distB="114300" distT="114300" distL="114300" distR="114300">
             <wp:extent cx="5399730" cy="4254500"/>
             <wp:effectExtent b="25400" l="25400" r="25400" t="25400"/>
-            <wp:docPr id="3" name="image13.png"/>
+            <wp:docPr id="3" name="image15.png"/>
             <a:graphic>
               <a:graphicData uri="http://schemas.openxmlformats.org/drawingml/2006/picture">
                 <pic:pic>
                   <pic:nvPicPr>
-                    <pic:cNvPr id="0" name="image13.png"/>
+                    <pic:cNvPr id="0" name="image15.png"/>
                     <pic:cNvPicPr preferRelativeResize="0"/>
                   </pic:nvPicPr>
                   <pic:blipFill>
@@ -15603,12 +16856,12 @@
           <wp:inline distB="114300" distT="114300" distL="114300" distR="114300">
             <wp:extent cx="5399730" cy="6235700"/>
             <wp:effectExtent b="25400" l="25400" r="25400" t="25400"/>
-            <wp:docPr id="5" name="image11.png"/>
+            <wp:docPr id="5" name="image3.png"/>
             <a:graphic>
               <a:graphicData uri="http://schemas.openxmlformats.org/drawingml/2006/picture">
                 <pic:pic>
                   <pic:nvPicPr>
-                    <pic:cNvPr id="0" name="image11.png"/>
+                    <pic:cNvPr id="0" name="image3.png"/>
                     <pic:cNvPicPr preferRelativeResize="0"/>
                   </pic:nvPicPr>
                   <pic:blipFill>
@@ -15774,12 +17027,12 @@
           <wp:inline distB="114300" distT="114300" distL="114300" distR="114300">
             <wp:extent cx="5399730" cy="4127500"/>
             <wp:effectExtent b="25400" l="25400" r="25400" t="25400"/>
-            <wp:docPr id="2" name="image5.png"/>
+            <wp:docPr id="2" name="image4.png"/>
             <a:graphic>
               <a:graphicData uri="http://schemas.openxmlformats.org/drawingml/2006/picture">
                 <pic:pic>
                   <pic:nvPicPr>
-                    <pic:cNvPr id="0" name="image5.png"/>
+                    <pic:cNvPr id="0" name="image4.png"/>
                     <pic:cNvPicPr preferRelativeResize="0"/>
                   </pic:nvPicPr>
                   <pic:blipFill>
@@ -16047,12 +17300,12 @@
           <wp:inline distB="114300" distT="114300" distL="114300" distR="114300">
             <wp:extent cx="5399730" cy="3581400"/>
             <wp:effectExtent b="25400" l="25400" r="25400" t="25400"/>
-            <wp:docPr id="12" name="image4.png"/>
+            <wp:docPr id="12" name="image7.png"/>
             <a:graphic>
               <a:graphicData uri="http://schemas.openxmlformats.org/drawingml/2006/picture">
                 <pic:pic>
                   <pic:nvPicPr>
-                    <pic:cNvPr id="0" name="image4.png"/>
+                    <pic:cNvPr id="0" name="image7.png"/>
                     <pic:cNvPicPr preferRelativeResize="0"/>
                   </pic:nvPicPr>
                   <pic:blipFill>
@@ -16324,12 +17577,12 @@
           <wp:inline distB="114300" distT="114300" distL="114300" distR="114300">
             <wp:extent cx="5399730" cy="3314700"/>
             <wp:effectExtent b="25400" l="25400" r="25400" t="25400"/>
-            <wp:docPr id="15" name="image9.png"/>
+            <wp:docPr id="15" name="image6.png"/>
             <a:graphic>
               <a:graphicData uri="http://schemas.openxmlformats.org/drawingml/2006/picture">
                 <pic:pic>
                   <pic:nvPicPr>
-                    <pic:cNvPr id="0" name="image9.png"/>
+                    <pic:cNvPr id="0" name="image6.png"/>
                     <pic:cNvPicPr preferRelativeResize="0"/>
                   </pic:nvPicPr>
                   <pic:blipFill>
@@ -16410,12 +17663,12 @@
           <wp:inline distB="114300" distT="114300" distL="114300" distR="114300">
             <wp:extent cx="5399730" cy="3086100"/>
             <wp:effectExtent b="25400" l="25400" r="25400" t="25400"/>
-            <wp:docPr id="16" name="image3.png"/>
+            <wp:docPr id="16" name="image5.png"/>
             <a:graphic>
               <a:graphicData uri="http://schemas.openxmlformats.org/drawingml/2006/picture">
                 <pic:pic>
                   <pic:nvPicPr>
-                    <pic:cNvPr id="0" name="image3.png"/>
+                    <pic:cNvPr id="0" name="image5.png"/>
                     <pic:cNvPicPr preferRelativeResize="0"/>
                   </pic:nvPicPr>
                   <pic:blipFill>
@@ -16530,12 +17783,12 @@
           <wp:inline distB="114300" distT="114300" distL="114300" distR="114300">
             <wp:extent cx="5399730" cy="3200400"/>
             <wp:effectExtent b="25400" l="25400" r="25400" t="25400"/>
-            <wp:docPr id="8" name="image12.png"/>
+            <wp:docPr id="8" name="image11.png"/>
             <a:graphic>
               <a:graphicData uri="http://schemas.openxmlformats.org/drawingml/2006/picture">
                 <pic:pic>
                   <pic:nvPicPr>
-                    <pic:cNvPr id="0" name="image12.png"/>
+                    <pic:cNvPr id="0" name="image11.png"/>
                     <pic:cNvPicPr preferRelativeResize="0"/>
                   </pic:nvPicPr>
                   <pic:blipFill>
@@ -16770,12 +18023,12 @@
           <wp:inline distB="114300" distT="114300" distL="114300" distR="114300">
             <wp:extent cx="5399730" cy="2743200"/>
             <wp:effectExtent b="25400" l="25400" r="25400" t="25400"/>
-            <wp:docPr id="11" name="image7.png"/>
+            <wp:docPr id="11" name="image13.png"/>
             <a:graphic>
               <a:graphicData uri="http://schemas.openxmlformats.org/drawingml/2006/picture">
                 <pic:pic>
                   <pic:nvPicPr>
-                    <pic:cNvPr id="0" name="image7.png"/>
+                    <pic:cNvPr id="0" name="image13.png"/>
                     <pic:cNvPicPr preferRelativeResize="0"/>
                   </pic:nvPicPr>
                   <pic:blipFill>
@@ -16856,12 +18109,12 @@
           <wp:inline distB="114300" distT="114300" distL="114300" distR="114300">
             <wp:extent cx="5399730" cy="2260600"/>
             <wp:effectExtent b="25400" l="25400" r="25400" t="25400"/>
-            <wp:docPr id="1" name="image6.png"/>
+            <wp:docPr id="1" name="image12.png"/>
             <a:graphic>
               <a:graphicData uri="http://schemas.openxmlformats.org/drawingml/2006/picture">
                 <pic:pic>
                   <pic:nvPicPr>
-                    <pic:cNvPr id="0" name="image6.png"/>
+                    <pic:cNvPr id="0" name="image12.png"/>
                     <pic:cNvPicPr preferRelativeResize="0"/>
                   </pic:nvPicPr>
                   <pic:blipFill>
@@ -16941,12 +18194,12 @@
           <wp:inline distB="114300" distT="114300" distL="114300" distR="114300">
             <wp:extent cx="5019675" cy="3429000"/>
             <wp:effectExtent b="25400" l="25400" r="25400" t="25400"/>
-            <wp:docPr id="6" name="image17.png"/>
+            <wp:docPr id="6" name="image14.png"/>
             <a:graphic>
               <a:graphicData uri="http://schemas.openxmlformats.org/drawingml/2006/picture">
                 <pic:pic>
                   <pic:nvPicPr>
-                    <pic:cNvPr id="0" name="image17.png"/>
+                    <pic:cNvPr id="0" name="image14.png"/>
                     <pic:cNvPicPr preferRelativeResize="0"/>
                   </pic:nvPicPr>
                   <pic:blipFill>

</xml_diff>